<commit_message>
Update link mini project in report mini project file
</commit_message>
<xml_diff>
--- a/NguyenMinhTrung_N25DTCN064_IT202_SS4_BaoCaoSauBuoiThucHanh.docx
+++ b/NguyenMinhTrung_N25DTCN064_IT202_SS4_BaoCaoSauBuoiThucHanh.docx
@@ -25,10 +25,39 @@
         </w:rPr>
       </w:pPr>
       <w:r>
-        <w:t xml:space="preserve">Môn học: </w:t>
-      </w:r>
-      <w:r>
-        <w:t>Cơ Sở Dữ Liệu</w:t>
+        <w:t xml:space="preserve">Môn </w:t>
+      </w:r>
+      <w:proofErr w:type="spellStart"/>
+      <w:r>
+        <w:t>học</w:t>
+      </w:r>
+      <w:proofErr w:type="spellEnd"/>
+      <w:r>
+        <w:t xml:space="preserve">: </w:t>
+      </w:r>
+      <w:proofErr w:type="spellStart"/>
+      <w:r>
+        <w:t>Cơ</w:t>
+      </w:r>
+      <w:proofErr w:type="spellEnd"/>
+      <w:r>
+        <w:t xml:space="preserve"> </w:t>
+      </w:r>
+      <w:proofErr w:type="spellStart"/>
+      <w:r>
+        <w:t>Sở</w:t>
+      </w:r>
+      <w:proofErr w:type="spellEnd"/>
+      <w:r>
+        <w:t xml:space="preserve"> </w:t>
+      </w:r>
+      <w:proofErr w:type="spellStart"/>
+      <w:r>
+        <w:t>Dữ</w:t>
+      </w:r>
+      <w:proofErr w:type="spellEnd"/>
+      <w:r>
+        <w:t xml:space="preserve"> Liệu</w:t>
       </w:r>
     </w:p>
     <w:p>
@@ -38,11 +67,96 @@
           <w:bCs/>
         </w:rPr>
       </w:pPr>
-      <w:r>
-        <w:t xml:space="preserve">Tên buổi thực hành: Thực hành </w:t>
-      </w:r>
-      <w:r>
-        <w:t>Các nhóm câu lệnh DDL và DML trong MySQL</w:t>
+      <w:proofErr w:type="spellStart"/>
+      <w:r>
+        <w:t>Tên</w:t>
+      </w:r>
+      <w:proofErr w:type="spellEnd"/>
+      <w:r>
+        <w:t xml:space="preserve"> </w:t>
+      </w:r>
+      <w:proofErr w:type="spellStart"/>
+      <w:r>
+        <w:t>buổi</w:t>
+      </w:r>
+      <w:proofErr w:type="spellEnd"/>
+      <w:r>
+        <w:t xml:space="preserve"> </w:t>
+      </w:r>
+      <w:proofErr w:type="spellStart"/>
+      <w:r>
+        <w:t>thực</w:t>
+      </w:r>
+      <w:proofErr w:type="spellEnd"/>
+      <w:r>
+        <w:t xml:space="preserve"> </w:t>
+      </w:r>
+      <w:proofErr w:type="spellStart"/>
+      <w:r>
+        <w:t>hành</w:t>
+      </w:r>
+      <w:proofErr w:type="spellEnd"/>
+      <w:r>
+        <w:t xml:space="preserve">: </w:t>
+      </w:r>
+      <w:proofErr w:type="spellStart"/>
+      <w:r>
+        <w:t>Thực</w:t>
+      </w:r>
+      <w:proofErr w:type="spellEnd"/>
+      <w:r>
+        <w:t xml:space="preserve"> </w:t>
+      </w:r>
+      <w:proofErr w:type="spellStart"/>
+      <w:r>
+        <w:t>hành</w:t>
+      </w:r>
+      <w:proofErr w:type="spellEnd"/>
+      <w:r>
+        <w:t xml:space="preserve"> </w:t>
+      </w:r>
+      <w:r>
+        <w:t xml:space="preserve">Các </w:t>
+      </w:r>
+      <w:proofErr w:type="spellStart"/>
+      <w:r>
+        <w:t>nhóm</w:t>
+      </w:r>
+      <w:proofErr w:type="spellEnd"/>
+      <w:r>
+        <w:t xml:space="preserve"> </w:t>
+      </w:r>
+      <w:proofErr w:type="spellStart"/>
+      <w:r>
+        <w:t>câu</w:t>
+      </w:r>
+      <w:proofErr w:type="spellEnd"/>
+      <w:r>
+        <w:t xml:space="preserve"> </w:t>
+      </w:r>
+      <w:proofErr w:type="spellStart"/>
+      <w:r>
+        <w:t>lệnh</w:t>
+      </w:r>
+      <w:proofErr w:type="spellEnd"/>
+      <w:r>
+        <w:t xml:space="preserve"> DDL </w:t>
+      </w:r>
+      <w:proofErr w:type="spellStart"/>
+      <w:r>
+        <w:t>và</w:t>
+      </w:r>
+      <w:proofErr w:type="spellEnd"/>
+      <w:r>
+        <w:t xml:space="preserve"> DML </w:t>
+      </w:r>
+      <w:proofErr w:type="spellStart"/>
+      <w:r>
+        <w:t>trong</w:t>
+      </w:r>
+      <w:proofErr w:type="spellEnd"/>
+      <w:r>
+        <w:t xml:space="preserve"> MySQL</w:t>
       </w:r>
     </w:p>
     <w:p>
@@ -52,8 +166,37 @@
           <w:bCs/>
         </w:rPr>
       </w:pPr>
-      <w:r>
-        <w:t>Thời gian thực hành: 180p</w:t>
+      <w:proofErr w:type="spellStart"/>
+      <w:r>
+        <w:t>Thời</w:t>
+      </w:r>
+      <w:proofErr w:type="spellEnd"/>
+      <w:r>
+        <w:t xml:space="preserve"> </w:t>
+      </w:r>
+      <w:proofErr w:type="spellStart"/>
+      <w:r>
+        <w:t>gian</w:t>
+      </w:r>
+      <w:proofErr w:type="spellEnd"/>
+      <w:r>
+        <w:t xml:space="preserve"> </w:t>
+      </w:r>
+      <w:proofErr w:type="spellStart"/>
+      <w:r>
+        <w:t>thực</w:t>
+      </w:r>
+      <w:proofErr w:type="spellEnd"/>
+      <w:r>
+        <w:t xml:space="preserve"> </w:t>
+      </w:r>
+      <w:proofErr w:type="spellStart"/>
+      <w:r>
+        <w:t>hành</w:t>
+      </w:r>
+      <w:proofErr w:type="spellEnd"/>
+      <w:r>
+        <w:t>: 180p</w:t>
       </w:r>
     </w:p>
     <w:p>
@@ -63,8 +206,45 @@
           <w:bCs/>
         </w:rPr>
       </w:pPr>
-      <w:r>
-        <w:t>Họ và tên sinh viên: Nguyễn Minh Trung</w:t>
+      <w:proofErr w:type="spellStart"/>
+      <w:r>
+        <w:t>Họ</w:t>
+      </w:r>
+      <w:proofErr w:type="spellEnd"/>
+      <w:r>
+        <w:t xml:space="preserve"> </w:t>
+      </w:r>
+      <w:proofErr w:type="spellStart"/>
+      <w:r>
+        <w:t>và</w:t>
+      </w:r>
+      <w:proofErr w:type="spellEnd"/>
+      <w:r>
+        <w:t xml:space="preserve"> </w:t>
+      </w:r>
+      <w:proofErr w:type="spellStart"/>
+      <w:r>
+        <w:t>tên</w:t>
+      </w:r>
+      <w:proofErr w:type="spellEnd"/>
+      <w:r>
+        <w:t xml:space="preserve"> </w:t>
+      </w:r>
+      <w:proofErr w:type="spellStart"/>
+      <w:r>
+        <w:t>sinh</w:t>
+      </w:r>
+      <w:proofErr w:type="spellEnd"/>
+      <w:r>
+        <w:t xml:space="preserve"> </w:t>
+      </w:r>
+      <w:proofErr w:type="spellStart"/>
+      <w:r>
+        <w:t>viên</w:t>
+      </w:r>
+      <w:proofErr w:type="spellEnd"/>
+      <w:r>
+        <w:t>: Nguyễn Minh Trung</w:t>
       </w:r>
     </w:p>
     <w:p>
@@ -74,8 +254,29 @@
           <w:bCs/>
         </w:rPr>
       </w:pPr>
-      <w:r>
-        <w:t>Mã sinh viên: N25DTCN064 </w:t>
+      <w:proofErr w:type="spellStart"/>
+      <w:r>
+        <w:t>Mã</w:t>
+      </w:r>
+      <w:proofErr w:type="spellEnd"/>
+      <w:r>
+        <w:t xml:space="preserve"> </w:t>
+      </w:r>
+      <w:proofErr w:type="spellStart"/>
+      <w:r>
+        <w:t>sinh</w:t>
+      </w:r>
+      <w:proofErr w:type="spellEnd"/>
+      <w:r>
+        <w:t xml:space="preserve"> </w:t>
+      </w:r>
+      <w:proofErr w:type="spellStart"/>
+      <w:r>
+        <w:t>viên</w:t>
+      </w:r>
+      <w:proofErr w:type="spellEnd"/>
+      <w:r>
+        <w:t>: N25DTCN064 </w:t>
       </w:r>
     </w:p>
     <w:p>
@@ -85,8 +286,13 @@
           <w:bCs/>
         </w:rPr>
       </w:pPr>
-      <w:r>
-        <w:t>Lớp: HCM-KS25-CNTT</w:t>
+      <w:proofErr w:type="spellStart"/>
+      <w:r>
+        <w:t>Lớp</w:t>
+      </w:r>
+      <w:proofErr w:type="spellEnd"/>
+      <w:r>
+        <w:t>: HCM-KS25-CNTT</w:t>
       </w:r>
       <w:r>
         <w:t>5</w:t>
@@ -99,8 +305,13 @@
           <w:bCs/>
         </w:rPr>
       </w:pPr>
-      <w:r>
-        <w:t xml:space="preserve">Nhóm: </w:t>
+      <w:proofErr w:type="spellStart"/>
+      <w:r>
+        <w:t>Nhóm</w:t>
+      </w:r>
+      <w:proofErr w:type="spellEnd"/>
+      <w:r>
+        <w:t xml:space="preserve">: </w:t>
       </w:r>
       <w:r>
         <w:t>1</w:t>
@@ -122,13 +333,116 @@
           <w:numId w:val="1"/>
         </w:numPr>
       </w:pPr>
-      <w:r>
-        <w:t>Trình bày các giải pháp</w:t>
-      </w:r>
+      <w:proofErr w:type="spellStart"/>
+      <w:r>
+        <w:t>Trình</w:t>
+      </w:r>
+      <w:proofErr w:type="spellEnd"/>
+      <w:r>
+        <w:t xml:space="preserve"> </w:t>
+      </w:r>
+      <w:proofErr w:type="spellStart"/>
+      <w:r>
+        <w:t>bày</w:t>
+      </w:r>
+      <w:proofErr w:type="spellEnd"/>
+      <w:r>
+        <w:t xml:space="preserve"> </w:t>
+      </w:r>
+      <w:proofErr w:type="spellStart"/>
+      <w:r>
+        <w:t>các</w:t>
+      </w:r>
+      <w:proofErr w:type="spellEnd"/>
+      <w:r>
+        <w:t xml:space="preserve"> </w:t>
+      </w:r>
+      <w:proofErr w:type="spellStart"/>
+      <w:r>
+        <w:t>giải</w:t>
+      </w:r>
+      <w:proofErr w:type="spellEnd"/>
+      <w:r>
+        <w:t xml:space="preserve"> </w:t>
+      </w:r>
+      <w:proofErr w:type="spellStart"/>
+      <w:r>
+        <w:t>pháp</w:t>
+      </w:r>
+      <w:proofErr w:type="spellEnd"/>
     </w:p>
     <w:p>
-      <w:r>
-        <w:t xml:space="preserve">Bài hôm nay nhóm chúng em thấy trong menu mẫu có </w:t>
+      <w:proofErr w:type="spellStart"/>
+      <w:r>
+        <w:t>Bài</w:t>
+      </w:r>
+      <w:proofErr w:type="spellEnd"/>
+      <w:r>
+        <w:t xml:space="preserve"> </w:t>
+      </w:r>
+      <w:proofErr w:type="spellStart"/>
+      <w:r>
+        <w:t>hôm</w:t>
+      </w:r>
+      <w:proofErr w:type="spellEnd"/>
+      <w:r>
+        <w:t xml:space="preserve"> nay </w:t>
+      </w:r>
+      <w:proofErr w:type="spellStart"/>
+      <w:r>
+        <w:t>nhóm</w:t>
+      </w:r>
+      <w:proofErr w:type="spellEnd"/>
+      <w:r>
+        <w:t xml:space="preserve"> </w:t>
+      </w:r>
+      <w:proofErr w:type="spellStart"/>
+      <w:r>
+        <w:t>chúng</w:t>
+      </w:r>
+      <w:proofErr w:type="spellEnd"/>
+      <w:r>
+        <w:t xml:space="preserve"> </w:t>
+      </w:r>
+      <w:proofErr w:type="spellStart"/>
+      <w:r>
+        <w:t>em</w:t>
+      </w:r>
+      <w:proofErr w:type="spellEnd"/>
+      <w:r>
+        <w:t xml:space="preserve"> </w:t>
+      </w:r>
+      <w:proofErr w:type="spellStart"/>
+      <w:r>
+        <w:t>thấy</w:t>
+      </w:r>
+      <w:proofErr w:type="spellEnd"/>
+      <w:r>
+        <w:t xml:space="preserve"> </w:t>
+      </w:r>
+      <w:proofErr w:type="spellStart"/>
+      <w:r>
+        <w:t>trong</w:t>
+      </w:r>
+      <w:proofErr w:type="spellEnd"/>
+      <w:r>
+        <w:t xml:space="preserve"> menu </w:t>
+      </w:r>
+      <w:proofErr w:type="spellStart"/>
+      <w:r>
+        <w:t>mẫu</w:t>
+      </w:r>
+      <w:proofErr w:type="spellEnd"/>
+      <w:r>
+        <w:t xml:space="preserve"> </w:t>
+      </w:r>
+      <w:proofErr w:type="spellStart"/>
+      <w:r>
+        <w:t>có</w:t>
+      </w:r>
+      <w:proofErr w:type="spellEnd"/>
+      <w:r>
+        <w:t xml:space="preserve"> </w:t>
       </w:r>
       <w:r>
         <w:t>5</w:t>
@@ -136,20 +450,317 @@
       <w:r>
         <w:t xml:space="preserve"> </w:t>
       </w:r>
+      <w:proofErr w:type="spellStart"/>
       <w:r>
         <w:t>phần</w:t>
       </w:r>
-      <w:r>
-        <w:t xml:space="preserve"> nên nhóm em đã chia mỗi người ra một phần</w:t>
-      </w:r>
-      <w:r>
-        <w:t xml:space="preserve"> và một số phần khó có 2 tham gia cùng làm</w:t>
-      </w:r>
-      <w:r>
-        <w:t>. Sử dụng nền tảng kiến thức về</w:t>
-      </w:r>
-      <w:r>
-        <w:t xml:space="preserve"> hệ quản trị cơ sở dữ lieu MySQL, Các nhóm lệnh cơ bản như DDL (CREATE, DROP, ALTER) và DML (INSERT, UPDATE, DELETE, SELECT).</w:t>
+      <w:proofErr w:type="spellEnd"/>
+      <w:r>
+        <w:t xml:space="preserve"> </w:t>
+      </w:r>
+      <w:proofErr w:type="spellStart"/>
+      <w:r>
+        <w:t>nên</w:t>
+      </w:r>
+      <w:proofErr w:type="spellEnd"/>
+      <w:r>
+        <w:t xml:space="preserve"> </w:t>
+      </w:r>
+      <w:proofErr w:type="spellStart"/>
+      <w:r>
+        <w:t>nhóm</w:t>
+      </w:r>
+      <w:proofErr w:type="spellEnd"/>
+      <w:r>
+        <w:t xml:space="preserve"> </w:t>
+      </w:r>
+      <w:proofErr w:type="spellStart"/>
+      <w:r>
+        <w:t>em</w:t>
+      </w:r>
+      <w:proofErr w:type="spellEnd"/>
+      <w:r>
+        <w:t xml:space="preserve"> </w:t>
+      </w:r>
+      <w:proofErr w:type="spellStart"/>
+      <w:r>
+        <w:t>đã</w:t>
+      </w:r>
+      <w:proofErr w:type="spellEnd"/>
+      <w:r>
+        <w:t xml:space="preserve"> chia </w:t>
+      </w:r>
+      <w:proofErr w:type="spellStart"/>
+      <w:r>
+        <w:t>mỗi</w:t>
+      </w:r>
+      <w:proofErr w:type="spellEnd"/>
+      <w:r>
+        <w:t xml:space="preserve"> </w:t>
+      </w:r>
+      <w:proofErr w:type="spellStart"/>
+      <w:r>
+        <w:t>người</w:t>
+      </w:r>
+      <w:proofErr w:type="spellEnd"/>
+      <w:r>
+        <w:t xml:space="preserve"> </w:t>
+      </w:r>
+      <w:proofErr w:type="spellStart"/>
+      <w:r>
+        <w:t>ra</w:t>
+      </w:r>
+      <w:proofErr w:type="spellEnd"/>
+      <w:r>
+        <w:t xml:space="preserve"> </w:t>
+      </w:r>
+      <w:proofErr w:type="spellStart"/>
+      <w:r>
+        <w:t>một</w:t>
+      </w:r>
+      <w:proofErr w:type="spellEnd"/>
+      <w:r>
+        <w:t xml:space="preserve"> </w:t>
+      </w:r>
+      <w:proofErr w:type="spellStart"/>
+      <w:r>
+        <w:t>phần</w:t>
+      </w:r>
+      <w:proofErr w:type="spellEnd"/>
+      <w:r>
+        <w:t xml:space="preserve"> </w:t>
+      </w:r>
+      <w:proofErr w:type="spellStart"/>
+      <w:r>
+        <w:t>và</w:t>
+      </w:r>
+      <w:proofErr w:type="spellEnd"/>
+      <w:r>
+        <w:t xml:space="preserve"> </w:t>
+      </w:r>
+      <w:proofErr w:type="spellStart"/>
+      <w:r>
+        <w:t>một</w:t>
+      </w:r>
+      <w:proofErr w:type="spellEnd"/>
+      <w:r>
+        <w:t xml:space="preserve"> </w:t>
+      </w:r>
+      <w:proofErr w:type="spellStart"/>
+      <w:r>
+        <w:t>số</w:t>
+      </w:r>
+      <w:proofErr w:type="spellEnd"/>
+      <w:r>
+        <w:t xml:space="preserve"> </w:t>
+      </w:r>
+      <w:proofErr w:type="spellStart"/>
+      <w:r>
+        <w:t>phần</w:t>
+      </w:r>
+      <w:proofErr w:type="spellEnd"/>
+      <w:r>
+        <w:t xml:space="preserve"> </w:t>
+      </w:r>
+      <w:proofErr w:type="spellStart"/>
+      <w:r>
+        <w:t>khó</w:t>
+      </w:r>
+      <w:proofErr w:type="spellEnd"/>
+      <w:r>
+        <w:t xml:space="preserve"> </w:t>
+      </w:r>
+      <w:proofErr w:type="spellStart"/>
+      <w:r>
+        <w:t>có</w:t>
+      </w:r>
+      <w:proofErr w:type="spellEnd"/>
+      <w:r>
+        <w:t xml:space="preserve"> 2 </w:t>
+      </w:r>
+      <w:proofErr w:type="spellStart"/>
+      <w:r>
+        <w:t>tham</w:t>
+      </w:r>
+      <w:proofErr w:type="spellEnd"/>
+      <w:r>
+        <w:t xml:space="preserve"> </w:t>
+      </w:r>
+      <w:proofErr w:type="spellStart"/>
+      <w:r>
+        <w:t>gia</w:t>
+      </w:r>
+      <w:proofErr w:type="spellEnd"/>
+      <w:r>
+        <w:t xml:space="preserve"> </w:t>
+      </w:r>
+      <w:proofErr w:type="spellStart"/>
+      <w:r>
+        <w:t>cùng</w:t>
+      </w:r>
+      <w:proofErr w:type="spellEnd"/>
+      <w:r>
+        <w:t xml:space="preserve"> </w:t>
+      </w:r>
+      <w:proofErr w:type="spellStart"/>
+      <w:r>
+        <w:t>làm</w:t>
+      </w:r>
+      <w:proofErr w:type="spellEnd"/>
+      <w:r>
+        <w:t xml:space="preserve">. </w:t>
+      </w:r>
+      <w:proofErr w:type="spellStart"/>
+      <w:r>
+        <w:t>Sử</w:t>
+      </w:r>
+      <w:proofErr w:type="spellEnd"/>
+      <w:r>
+        <w:t xml:space="preserve"> </w:t>
+      </w:r>
+      <w:proofErr w:type="spellStart"/>
+      <w:r>
+        <w:t>dụng</w:t>
+      </w:r>
+      <w:proofErr w:type="spellEnd"/>
+      <w:r>
+        <w:t xml:space="preserve"> </w:t>
+      </w:r>
+      <w:proofErr w:type="spellStart"/>
+      <w:r>
+        <w:t>nền</w:t>
+      </w:r>
+      <w:proofErr w:type="spellEnd"/>
+      <w:r>
+        <w:t xml:space="preserve"> </w:t>
+      </w:r>
+      <w:proofErr w:type="spellStart"/>
+      <w:r>
+        <w:t>tảng</w:t>
+      </w:r>
+      <w:proofErr w:type="spellEnd"/>
+      <w:r>
+        <w:t xml:space="preserve"> </w:t>
+      </w:r>
+      <w:proofErr w:type="spellStart"/>
+      <w:r>
+        <w:t>kiến</w:t>
+      </w:r>
+      <w:proofErr w:type="spellEnd"/>
+      <w:r>
+        <w:t xml:space="preserve"> </w:t>
+      </w:r>
+      <w:proofErr w:type="spellStart"/>
+      <w:r>
+        <w:t>thức</w:t>
+      </w:r>
+      <w:proofErr w:type="spellEnd"/>
+      <w:r>
+        <w:t xml:space="preserve"> </w:t>
+      </w:r>
+      <w:proofErr w:type="spellStart"/>
+      <w:r>
+        <w:t>về</w:t>
+      </w:r>
+      <w:proofErr w:type="spellEnd"/>
+      <w:r>
+        <w:t xml:space="preserve"> </w:t>
+      </w:r>
+      <w:proofErr w:type="spellStart"/>
+      <w:r>
+        <w:t>hệ</w:t>
+      </w:r>
+      <w:proofErr w:type="spellEnd"/>
+      <w:r>
+        <w:t xml:space="preserve"> </w:t>
+      </w:r>
+      <w:proofErr w:type="spellStart"/>
+      <w:r>
+        <w:t>quản</w:t>
+      </w:r>
+      <w:proofErr w:type="spellEnd"/>
+      <w:r>
+        <w:t xml:space="preserve"> </w:t>
+      </w:r>
+      <w:proofErr w:type="spellStart"/>
+      <w:r>
+        <w:t>trị</w:t>
+      </w:r>
+      <w:proofErr w:type="spellEnd"/>
+      <w:r>
+        <w:t xml:space="preserve"> </w:t>
+      </w:r>
+      <w:proofErr w:type="spellStart"/>
+      <w:r>
+        <w:t>cơ</w:t>
+      </w:r>
+      <w:proofErr w:type="spellEnd"/>
+      <w:r>
+        <w:t xml:space="preserve"> </w:t>
+      </w:r>
+      <w:proofErr w:type="spellStart"/>
+      <w:r>
+        <w:t>sở</w:t>
+      </w:r>
+      <w:proofErr w:type="spellEnd"/>
+      <w:r>
+        <w:t xml:space="preserve"> </w:t>
+      </w:r>
+      <w:proofErr w:type="spellStart"/>
+      <w:r>
+        <w:t>dữ</w:t>
+      </w:r>
+      <w:proofErr w:type="spellEnd"/>
+      <w:r>
+        <w:t xml:space="preserve"> lieu MySQL, Các </w:t>
+      </w:r>
+      <w:proofErr w:type="spellStart"/>
+      <w:r>
+        <w:t>nhóm</w:t>
+      </w:r>
+      <w:proofErr w:type="spellEnd"/>
+      <w:r>
+        <w:t xml:space="preserve"> </w:t>
+      </w:r>
+      <w:proofErr w:type="spellStart"/>
+      <w:r>
+        <w:t>lệnh</w:t>
+      </w:r>
+      <w:proofErr w:type="spellEnd"/>
+      <w:r>
+        <w:t xml:space="preserve"> </w:t>
+      </w:r>
+      <w:proofErr w:type="spellStart"/>
+      <w:r>
+        <w:t>cơ</w:t>
+      </w:r>
+      <w:proofErr w:type="spellEnd"/>
+      <w:r>
+        <w:t xml:space="preserve"> </w:t>
+      </w:r>
+      <w:proofErr w:type="spellStart"/>
+      <w:r>
+        <w:t>bản</w:t>
+      </w:r>
+      <w:proofErr w:type="spellEnd"/>
+      <w:r>
+        <w:t xml:space="preserve"> </w:t>
+      </w:r>
+      <w:proofErr w:type="spellStart"/>
+      <w:r>
+        <w:t>như</w:t>
+      </w:r>
+      <w:proofErr w:type="spellEnd"/>
+      <w:r>
+        <w:t xml:space="preserve"> DDL (CREATE, DROP, ALTER) </w:t>
+      </w:r>
+      <w:proofErr w:type="spellStart"/>
+      <w:r>
+        <w:t>và</w:t>
+      </w:r>
+      <w:proofErr w:type="spellEnd"/>
+      <w:r>
+        <w:t xml:space="preserve"> DML (INSERT, UPDATE, DELETE, SELECT).</w:t>
       </w:r>
     </w:p>
     <w:p>
@@ -159,8 +770,69 @@
           <w:numId w:val="1"/>
         </w:numPr>
       </w:pPr>
-      <w:r>
-        <w:t>Thực hành triển khai code thầy lấy ví dụ:</w:t>
+      <w:proofErr w:type="spellStart"/>
+      <w:r>
+        <w:t>Thực</w:t>
+      </w:r>
+      <w:proofErr w:type="spellEnd"/>
+      <w:r>
+        <w:t xml:space="preserve"> </w:t>
+      </w:r>
+      <w:proofErr w:type="spellStart"/>
+      <w:r>
+        <w:t>hành</w:t>
+      </w:r>
+      <w:proofErr w:type="spellEnd"/>
+      <w:r>
+        <w:t xml:space="preserve"> </w:t>
+      </w:r>
+      <w:proofErr w:type="spellStart"/>
+      <w:r>
+        <w:t>triển</w:t>
+      </w:r>
+      <w:proofErr w:type="spellEnd"/>
+      <w:r>
+        <w:t xml:space="preserve"> </w:t>
+      </w:r>
+      <w:proofErr w:type="spellStart"/>
+      <w:r>
+        <w:t>khai</w:t>
+      </w:r>
+      <w:proofErr w:type="spellEnd"/>
+      <w:r>
+        <w:t xml:space="preserve"> code </w:t>
+      </w:r>
+      <w:proofErr w:type="spellStart"/>
+      <w:r>
+        <w:t>thầy</w:t>
+      </w:r>
+      <w:proofErr w:type="spellEnd"/>
+      <w:r>
+        <w:t xml:space="preserve"> </w:t>
+      </w:r>
+      <w:proofErr w:type="spellStart"/>
+      <w:r>
+        <w:t>lấy</w:t>
+      </w:r>
+      <w:proofErr w:type="spellEnd"/>
+      <w:r>
+        <w:t xml:space="preserve"> </w:t>
+      </w:r>
+      <w:proofErr w:type="spellStart"/>
+      <w:r>
+        <w:t>ví</w:t>
+      </w:r>
+      <w:proofErr w:type="spellEnd"/>
+      <w:r>
+        <w:t xml:space="preserve"> </w:t>
+      </w:r>
+      <w:proofErr w:type="spellStart"/>
+      <w:r>
+        <w:t>dụ</w:t>
+      </w:r>
+      <w:proofErr w:type="spellEnd"/>
+      <w:r>
+        <w:t>:</w:t>
       </w:r>
     </w:p>
     <w:p>
@@ -171,13 +843,231 @@
         </w:numPr>
       </w:pPr>
       <w:r>
-        <w:t>Các kiến thức được sử dung.</w:t>
+        <w:t xml:space="preserve">Các </w:t>
+      </w:r>
+      <w:proofErr w:type="spellStart"/>
+      <w:r>
+        <w:t>kiến</w:t>
+      </w:r>
+      <w:proofErr w:type="spellEnd"/>
+      <w:r>
+        <w:t xml:space="preserve"> </w:t>
+      </w:r>
+      <w:proofErr w:type="spellStart"/>
+      <w:r>
+        <w:t>thức</w:t>
+      </w:r>
+      <w:proofErr w:type="spellEnd"/>
+      <w:r>
+        <w:t xml:space="preserve"> </w:t>
+      </w:r>
+      <w:proofErr w:type="spellStart"/>
+      <w:r>
+        <w:t>được</w:t>
+      </w:r>
+      <w:proofErr w:type="spellEnd"/>
+      <w:r>
+        <w:t xml:space="preserve"> </w:t>
+      </w:r>
+      <w:proofErr w:type="spellStart"/>
+      <w:r>
+        <w:t>sử</w:t>
+      </w:r>
+      <w:proofErr w:type="spellEnd"/>
+      <w:r>
+        <w:t xml:space="preserve"> dung.</w:t>
       </w:r>
     </w:p>
     <w:p>
-      <w:r>
-        <w:t>Hệ quản trị cơ sở dữ liệu mySQL, các nhóm lệnh DDL và DML, cách vẽ sơ đồ xác định input output của một cơ sở dữ liệu</w:t>
-      </w:r>
+      <w:proofErr w:type="spellStart"/>
+      <w:r>
+        <w:t>Hệ</w:t>
+      </w:r>
+      <w:proofErr w:type="spellEnd"/>
+      <w:r>
+        <w:t xml:space="preserve"> </w:t>
+      </w:r>
+      <w:proofErr w:type="spellStart"/>
+      <w:r>
+        <w:t>quản</w:t>
+      </w:r>
+      <w:proofErr w:type="spellEnd"/>
+      <w:r>
+        <w:t xml:space="preserve"> </w:t>
+      </w:r>
+      <w:proofErr w:type="spellStart"/>
+      <w:r>
+        <w:t>trị</w:t>
+      </w:r>
+      <w:proofErr w:type="spellEnd"/>
+      <w:r>
+        <w:t xml:space="preserve"> </w:t>
+      </w:r>
+      <w:proofErr w:type="spellStart"/>
+      <w:r>
+        <w:t>cơ</w:t>
+      </w:r>
+      <w:proofErr w:type="spellEnd"/>
+      <w:r>
+        <w:t xml:space="preserve"> </w:t>
+      </w:r>
+      <w:proofErr w:type="spellStart"/>
+      <w:r>
+        <w:t>sở</w:t>
+      </w:r>
+      <w:proofErr w:type="spellEnd"/>
+      <w:r>
+        <w:t xml:space="preserve"> </w:t>
+      </w:r>
+      <w:proofErr w:type="spellStart"/>
+      <w:r>
+        <w:t>dữ</w:t>
+      </w:r>
+      <w:proofErr w:type="spellEnd"/>
+      <w:r>
+        <w:t xml:space="preserve"> </w:t>
+      </w:r>
+      <w:proofErr w:type="spellStart"/>
+      <w:r>
+        <w:t>liệu</w:t>
+      </w:r>
+      <w:proofErr w:type="spellEnd"/>
+      <w:r>
+        <w:t xml:space="preserve"> </w:t>
+      </w:r>
+      <w:proofErr w:type="spellStart"/>
+      <w:r>
+        <w:t>mySQL</w:t>
+      </w:r>
+      <w:proofErr w:type="spellEnd"/>
+      <w:r>
+        <w:t xml:space="preserve">, </w:t>
+      </w:r>
+      <w:proofErr w:type="spellStart"/>
+      <w:r>
+        <w:t>các</w:t>
+      </w:r>
+      <w:proofErr w:type="spellEnd"/>
+      <w:r>
+        <w:t xml:space="preserve"> </w:t>
+      </w:r>
+      <w:proofErr w:type="spellStart"/>
+      <w:r>
+        <w:t>nhóm</w:t>
+      </w:r>
+      <w:proofErr w:type="spellEnd"/>
+      <w:r>
+        <w:t xml:space="preserve"> </w:t>
+      </w:r>
+      <w:proofErr w:type="spellStart"/>
+      <w:r>
+        <w:t>lệnh</w:t>
+      </w:r>
+      <w:proofErr w:type="spellEnd"/>
+      <w:r>
+        <w:t xml:space="preserve"> DDL </w:t>
+      </w:r>
+      <w:proofErr w:type="spellStart"/>
+      <w:r>
+        <w:t>và</w:t>
+      </w:r>
+      <w:proofErr w:type="spellEnd"/>
+      <w:r>
+        <w:t xml:space="preserve"> DML, </w:t>
+      </w:r>
+      <w:proofErr w:type="spellStart"/>
+      <w:r>
+        <w:t>cách</w:t>
+      </w:r>
+      <w:proofErr w:type="spellEnd"/>
+      <w:r>
+        <w:t xml:space="preserve"> </w:t>
+      </w:r>
+      <w:proofErr w:type="spellStart"/>
+      <w:r>
+        <w:t>vẽ</w:t>
+      </w:r>
+      <w:proofErr w:type="spellEnd"/>
+      <w:r>
+        <w:t xml:space="preserve"> </w:t>
+      </w:r>
+      <w:proofErr w:type="spellStart"/>
+      <w:r>
+        <w:t>sơ</w:t>
+      </w:r>
+      <w:proofErr w:type="spellEnd"/>
+      <w:r>
+        <w:t xml:space="preserve"> </w:t>
+      </w:r>
+      <w:proofErr w:type="spellStart"/>
+      <w:r>
+        <w:t>đồ</w:t>
+      </w:r>
+      <w:proofErr w:type="spellEnd"/>
+      <w:r>
+        <w:t xml:space="preserve"> </w:t>
+      </w:r>
+      <w:proofErr w:type="spellStart"/>
+      <w:r>
+        <w:t>xác</w:t>
+      </w:r>
+      <w:proofErr w:type="spellEnd"/>
+      <w:r>
+        <w:t xml:space="preserve"> </w:t>
+      </w:r>
+      <w:proofErr w:type="spellStart"/>
+      <w:r>
+        <w:t>định</w:t>
+      </w:r>
+      <w:proofErr w:type="spellEnd"/>
+      <w:r>
+        <w:t xml:space="preserve"> input output </w:t>
+      </w:r>
+      <w:proofErr w:type="spellStart"/>
+      <w:r>
+        <w:t>của</w:t>
+      </w:r>
+      <w:proofErr w:type="spellEnd"/>
+      <w:r>
+        <w:t xml:space="preserve"> </w:t>
+      </w:r>
+      <w:proofErr w:type="spellStart"/>
+      <w:r>
+        <w:t>một</w:t>
+      </w:r>
+      <w:proofErr w:type="spellEnd"/>
+      <w:r>
+        <w:t xml:space="preserve"> </w:t>
+      </w:r>
+      <w:proofErr w:type="spellStart"/>
+      <w:r>
+        <w:t>cơ</w:t>
+      </w:r>
+      <w:proofErr w:type="spellEnd"/>
+      <w:r>
+        <w:t xml:space="preserve"> </w:t>
+      </w:r>
+      <w:proofErr w:type="spellStart"/>
+      <w:r>
+        <w:t>sở</w:t>
+      </w:r>
+      <w:proofErr w:type="spellEnd"/>
+      <w:r>
+        <w:t xml:space="preserve"> </w:t>
+      </w:r>
+      <w:proofErr w:type="spellStart"/>
+      <w:r>
+        <w:t>dữ</w:t>
+      </w:r>
+      <w:proofErr w:type="spellEnd"/>
+      <w:r>
+        <w:t xml:space="preserve"> </w:t>
+      </w:r>
+      <w:proofErr w:type="spellStart"/>
+      <w:r>
+        <w:t>liệu</w:t>
+      </w:r>
+      <w:proofErr w:type="spellEnd"/>
     </w:p>
     <w:p>
       <w:pPr>
@@ -187,8 +1077,37 @@
         </w:numPr>
       </w:pPr>
       <w:r>
-        <w:t>DDL dùng những lệnh nào</w:t>
-      </w:r>
+        <w:t xml:space="preserve">DDL </w:t>
+      </w:r>
+      <w:proofErr w:type="spellStart"/>
+      <w:r>
+        <w:t>dùng</w:t>
+      </w:r>
+      <w:proofErr w:type="spellEnd"/>
+      <w:r>
+        <w:t xml:space="preserve"> </w:t>
+      </w:r>
+      <w:proofErr w:type="spellStart"/>
+      <w:r>
+        <w:t>những</w:t>
+      </w:r>
+      <w:proofErr w:type="spellEnd"/>
+      <w:r>
+        <w:t xml:space="preserve"> </w:t>
+      </w:r>
+      <w:proofErr w:type="spellStart"/>
+      <w:r>
+        <w:t>lệnh</w:t>
+      </w:r>
+      <w:proofErr w:type="spellEnd"/>
+      <w:r>
+        <w:t xml:space="preserve"> </w:t>
+      </w:r>
+      <w:proofErr w:type="spellStart"/>
+      <w:r>
+        <w:t>nào</w:t>
+      </w:r>
+      <w:proofErr w:type="spellEnd"/>
       <w:r>
         <w:t>?</w:t>
       </w:r>
@@ -206,8 +1125,37 @@
         </w:numPr>
       </w:pPr>
       <w:r>
-        <w:t>DML dùng những lệnh nào</w:t>
-      </w:r>
+        <w:t xml:space="preserve">DML </w:t>
+      </w:r>
+      <w:proofErr w:type="spellStart"/>
+      <w:r>
+        <w:t>dùng</w:t>
+      </w:r>
+      <w:proofErr w:type="spellEnd"/>
+      <w:r>
+        <w:t xml:space="preserve"> </w:t>
+      </w:r>
+      <w:proofErr w:type="spellStart"/>
+      <w:r>
+        <w:t>những</w:t>
+      </w:r>
+      <w:proofErr w:type="spellEnd"/>
+      <w:r>
+        <w:t xml:space="preserve"> </w:t>
+      </w:r>
+      <w:proofErr w:type="spellStart"/>
+      <w:r>
+        <w:t>lệnh</w:t>
+      </w:r>
+      <w:proofErr w:type="spellEnd"/>
+      <w:r>
+        <w:t xml:space="preserve"> </w:t>
+      </w:r>
+      <w:proofErr w:type="spellStart"/>
+      <w:r>
+        <w:t>nào</w:t>
+      </w:r>
+      <w:proofErr w:type="spellEnd"/>
       <w:r>
         <w:t>?</w:t>
       </w:r>
@@ -237,10 +1185,127 @@
         </w:numPr>
       </w:pPr>
       <w:r>
-        <w:t xml:space="preserve">Công việc cá nhân: Em làm về </w:t>
-      </w:r>
-      <w:r>
-        <w:t>phần cập nhật dữ liệu cho các thực thể (bảng).</w:t>
+        <w:t xml:space="preserve">Công </w:t>
+      </w:r>
+      <w:proofErr w:type="spellStart"/>
+      <w:r>
+        <w:t>việc</w:t>
+      </w:r>
+      <w:proofErr w:type="spellEnd"/>
+      <w:r>
+        <w:t xml:space="preserve"> </w:t>
+      </w:r>
+      <w:proofErr w:type="spellStart"/>
+      <w:r>
+        <w:t>cá</w:t>
+      </w:r>
+      <w:proofErr w:type="spellEnd"/>
+      <w:r>
+        <w:t xml:space="preserve"> </w:t>
+      </w:r>
+      <w:proofErr w:type="spellStart"/>
+      <w:r>
+        <w:t>nhân</w:t>
+      </w:r>
+      <w:proofErr w:type="spellEnd"/>
+      <w:r>
+        <w:t xml:space="preserve">: Em </w:t>
+      </w:r>
+      <w:proofErr w:type="spellStart"/>
+      <w:r>
+        <w:t>làm</w:t>
+      </w:r>
+      <w:proofErr w:type="spellEnd"/>
+      <w:r>
+        <w:t xml:space="preserve"> </w:t>
+      </w:r>
+      <w:proofErr w:type="spellStart"/>
+      <w:r>
+        <w:t>về</w:t>
+      </w:r>
+      <w:proofErr w:type="spellEnd"/>
+      <w:r>
+        <w:t xml:space="preserve"> </w:t>
+      </w:r>
+      <w:proofErr w:type="spellStart"/>
+      <w:r>
+        <w:t>phần</w:t>
+      </w:r>
+      <w:proofErr w:type="spellEnd"/>
+      <w:r>
+        <w:t xml:space="preserve"> </w:t>
+      </w:r>
+      <w:proofErr w:type="spellStart"/>
+      <w:r>
+        <w:t>cập</w:t>
+      </w:r>
+      <w:proofErr w:type="spellEnd"/>
+      <w:r>
+        <w:t xml:space="preserve"> </w:t>
+      </w:r>
+      <w:proofErr w:type="spellStart"/>
+      <w:r>
+        <w:t>nhật</w:t>
+      </w:r>
+      <w:proofErr w:type="spellEnd"/>
+      <w:r>
+        <w:t xml:space="preserve"> </w:t>
+      </w:r>
+      <w:proofErr w:type="spellStart"/>
+      <w:r>
+        <w:t>dữ</w:t>
+      </w:r>
+      <w:proofErr w:type="spellEnd"/>
+      <w:r>
+        <w:t xml:space="preserve"> </w:t>
+      </w:r>
+      <w:proofErr w:type="spellStart"/>
+      <w:r>
+        <w:t>liệu</w:t>
+      </w:r>
+      <w:proofErr w:type="spellEnd"/>
+      <w:r>
+        <w:t xml:space="preserve"> </w:t>
+      </w:r>
+      <w:proofErr w:type="spellStart"/>
+      <w:r>
+        <w:t>cho</w:t>
+      </w:r>
+      <w:proofErr w:type="spellEnd"/>
+      <w:r>
+        <w:t xml:space="preserve"> </w:t>
+      </w:r>
+      <w:proofErr w:type="spellStart"/>
+      <w:r>
+        <w:t>các</w:t>
+      </w:r>
+      <w:proofErr w:type="spellEnd"/>
+      <w:r>
+        <w:t xml:space="preserve"> </w:t>
+      </w:r>
+      <w:proofErr w:type="spellStart"/>
+      <w:r>
+        <w:t>thực</w:t>
+      </w:r>
+      <w:proofErr w:type="spellEnd"/>
+      <w:r>
+        <w:t xml:space="preserve"> </w:t>
+      </w:r>
+      <w:proofErr w:type="spellStart"/>
+      <w:r>
+        <w:t>thể</w:t>
+      </w:r>
+      <w:proofErr w:type="spellEnd"/>
+      <w:r>
+        <w:t xml:space="preserve"> (</w:t>
+      </w:r>
+      <w:proofErr w:type="spellStart"/>
+      <w:r>
+        <w:t>bảng</w:t>
+      </w:r>
+      <w:proofErr w:type="spellEnd"/>
+      <w:r>
+        <w:t>).</w:t>
       </w:r>
     </w:p>
     <w:p>
@@ -251,8 +1316,37 @@
         </w:numPr>
       </w:pPr>
       <w:r>
-        <w:t>Công việc nhóm: Hoàn thành miniproject</w:t>
-      </w:r>
+        <w:t xml:space="preserve">Công </w:t>
+      </w:r>
+      <w:proofErr w:type="spellStart"/>
+      <w:r>
+        <w:t>việc</w:t>
+      </w:r>
+      <w:proofErr w:type="spellEnd"/>
+      <w:r>
+        <w:t xml:space="preserve"> </w:t>
+      </w:r>
+      <w:proofErr w:type="spellStart"/>
+      <w:r>
+        <w:t>nhóm</w:t>
+      </w:r>
+      <w:proofErr w:type="spellEnd"/>
+      <w:r>
+        <w:t xml:space="preserve">: Hoàn </w:t>
+      </w:r>
+      <w:proofErr w:type="spellStart"/>
+      <w:r>
+        <w:t>thành</w:t>
+      </w:r>
+      <w:proofErr w:type="spellEnd"/>
+      <w:r>
+        <w:t xml:space="preserve"> </w:t>
+      </w:r>
+      <w:proofErr w:type="spellStart"/>
+      <w:r>
+        <w:t>miniproject</w:t>
+      </w:r>
+      <w:proofErr w:type="spellEnd"/>
     </w:p>
     <w:p>
       <w:r>
@@ -265,7 +1359,47 @@
     </w:p>
     <w:p>
       <w:r>
-        <w:t>Sau buổi thực hành, em đã:</w:t>
+        <w:t xml:space="preserve">Sau </w:t>
+      </w:r>
+      <w:proofErr w:type="spellStart"/>
+      <w:r>
+        <w:t>buổi</w:t>
+      </w:r>
+      <w:proofErr w:type="spellEnd"/>
+      <w:r>
+        <w:t xml:space="preserve"> </w:t>
+      </w:r>
+      <w:proofErr w:type="spellStart"/>
+      <w:r>
+        <w:t>thực</w:t>
+      </w:r>
+      <w:proofErr w:type="spellEnd"/>
+      <w:r>
+        <w:t xml:space="preserve"> </w:t>
+      </w:r>
+      <w:proofErr w:type="spellStart"/>
+      <w:r>
+        <w:t>hành</w:t>
+      </w:r>
+      <w:proofErr w:type="spellEnd"/>
+      <w:r>
+        <w:t xml:space="preserve">, </w:t>
+      </w:r>
+      <w:proofErr w:type="spellStart"/>
+      <w:r>
+        <w:t>em</w:t>
+      </w:r>
+      <w:proofErr w:type="spellEnd"/>
+      <w:r>
+        <w:t xml:space="preserve"> </w:t>
+      </w:r>
+      <w:proofErr w:type="spellStart"/>
+      <w:r>
+        <w:t>đã</w:t>
+      </w:r>
+      <w:proofErr w:type="spellEnd"/>
+      <w:r>
+        <w:t>:</w:t>
       </w:r>
     </w:p>
     <w:p>
@@ -275,23 +1409,318 @@
           <w:numId w:val="6"/>
         </w:numPr>
       </w:pPr>
-      <w:r>
-        <w:t xml:space="preserve">Hiểu rõ cách sử dụng </w:t>
-      </w:r>
-      <w:r>
-        <w:t>lệnh DDL và DML</w:t>
-      </w:r>
-      <w:r>
-        <w:t xml:space="preserve"> hay chưa? và hiểu như thế nào?</w:t>
+      <w:proofErr w:type="spellStart"/>
+      <w:r>
+        <w:t>Hiểu</w:t>
+      </w:r>
+      <w:proofErr w:type="spellEnd"/>
+      <w:r>
+        <w:t xml:space="preserve"> </w:t>
+      </w:r>
+      <w:proofErr w:type="spellStart"/>
+      <w:r>
+        <w:t>rõ</w:t>
+      </w:r>
+      <w:proofErr w:type="spellEnd"/>
+      <w:r>
+        <w:t xml:space="preserve"> </w:t>
+      </w:r>
+      <w:proofErr w:type="spellStart"/>
+      <w:r>
+        <w:t>cách</w:t>
+      </w:r>
+      <w:proofErr w:type="spellEnd"/>
+      <w:r>
+        <w:t xml:space="preserve"> </w:t>
+      </w:r>
+      <w:proofErr w:type="spellStart"/>
+      <w:r>
+        <w:t>sử</w:t>
+      </w:r>
+      <w:proofErr w:type="spellEnd"/>
+      <w:r>
+        <w:t xml:space="preserve"> </w:t>
+      </w:r>
+      <w:proofErr w:type="spellStart"/>
+      <w:r>
+        <w:t>dụng</w:t>
+      </w:r>
+      <w:proofErr w:type="spellEnd"/>
+      <w:r>
+        <w:t xml:space="preserve"> </w:t>
+      </w:r>
+      <w:proofErr w:type="spellStart"/>
+      <w:r>
+        <w:t>lệnh</w:t>
+      </w:r>
+      <w:proofErr w:type="spellEnd"/>
+      <w:r>
+        <w:t xml:space="preserve"> DDL </w:t>
+      </w:r>
+      <w:proofErr w:type="spellStart"/>
+      <w:r>
+        <w:t>và</w:t>
+      </w:r>
+      <w:proofErr w:type="spellEnd"/>
+      <w:r>
+        <w:t xml:space="preserve"> DML</w:t>
+      </w:r>
+      <w:r>
+        <w:t xml:space="preserve"> hay </w:t>
+      </w:r>
+      <w:proofErr w:type="spellStart"/>
+      <w:r>
+        <w:t>chưa</w:t>
+      </w:r>
+      <w:proofErr w:type="spellEnd"/>
+      <w:r>
+        <w:t xml:space="preserve">? </w:t>
+      </w:r>
+      <w:proofErr w:type="spellStart"/>
+      <w:r>
+        <w:t>và</w:t>
+      </w:r>
+      <w:proofErr w:type="spellEnd"/>
+      <w:r>
+        <w:t xml:space="preserve"> </w:t>
+      </w:r>
+      <w:proofErr w:type="spellStart"/>
+      <w:r>
+        <w:t>hiểu</w:t>
+      </w:r>
+      <w:proofErr w:type="spellEnd"/>
+      <w:r>
+        <w:t xml:space="preserve"> </w:t>
+      </w:r>
+      <w:proofErr w:type="spellStart"/>
+      <w:r>
+        <w:t>như</w:t>
+      </w:r>
+      <w:proofErr w:type="spellEnd"/>
+      <w:r>
+        <w:t xml:space="preserve"> </w:t>
+      </w:r>
+      <w:proofErr w:type="spellStart"/>
+      <w:r>
+        <w:t>thế</w:t>
+      </w:r>
+      <w:proofErr w:type="spellEnd"/>
+      <w:r>
+        <w:t xml:space="preserve"> </w:t>
+      </w:r>
+      <w:proofErr w:type="spellStart"/>
+      <w:r>
+        <w:t>nào</w:t>
+      </w:r>
+      <w:proofErr w:type="spellEnd"/>
+      <w:r>
+        <w:t>?</w:t>
       </w:r>
     </w:p>
     <w:p>
       <w:r>
         <w:lastRenderedPageBreak/>
-        <w:t>Em hiểu rõ hơn</w:t>
-      </w:r>
-      <w:r>
-        <w:t xml:space="preserve"> cách viết cấu trúc cú pháp của các câu lệnh và cách dùng chúng cho các yêu cầu thực tế từ miniproject.</w:t>
+        <w:t xml:space="preserve">Em </w:t>
+      </w:r>
+      <w:proofErr w:type="spellStart"/>
+      <w:r>
+        <w:t>hiểu</w:t>
+      </w:r>
+      <w:proofErr w:type="spellEnd"/>
+      <w:r>
+        <w:t xml:space="preserve"> </w:t>
+      </w:r>
+      <w:proofErr w:type="spellStart"/>
+      <w:r>
+        <w:t>rõ</w:t>
+      </w:r>
+      <w:proofErr w:type="spellEnd"/>
+      <w:r>
+        <w:t xml:space="preserve"> </w:t>
+      </w:r>
+      <w:proofErr w:type="spellStart"/>
+      <w:r>
+        <w:t>hơn</w:t>
+      </w:r>
+      <w:proofErr w:type="spellEnd"/>
+      <w:r>
+        <w:t xml:space="preserve"> </w:t>
+      </w:r>
+      <w:proofErr w:type="spellStart"/>
+      <w:r>
+        <w:t>cách</w:t>
+      </w:r>
+      <w:proofErr w:type="spellEnd"/>
+      <w:r>
+        <w:t xml:space="preserve"> </w:t>
+      </w:r>
+      <w:proofErr w:type="spellStart"/>
+      <w:r>
+        <w:t>viết</w:t>
+      </w:r>
+      <w:proofErr w:type="spellEnd"/>
+      <w:r>
+        <w:t xml:space="preserve"> </w:t>
+      </w:r>
+      <w:proofErr w:type="spellStart"/>
+      <w:r>
+        <w:t>cấu</w:t>
+      </w:r>
+      <w:proofErr w:type="spellEnd"/>
+      <w:r>
+        <w:t xml:space="preserve"> </w:t>
+      </w:r>
+      <w:proofErr w:type="spellStart"/>
+      <w:r>
+        <w:t>trúc</w:t>
+      </w:r>
+      <w:proofErr w:type="spellEnd"/>
+      <w:r>
+        <w:t xml:space="preserve"> </w:t>
+      </w:r>
+      <w:proofErr w:type="spellStart"/>
+      <w:r>
+        <w:t>cú</w:t>
+      </w:r>
+      <w:proofErr w:type="spellEnd"/>
+      <w:r>
+        <w:t xml:space="preserve"> </w:t>
+      </w:r>
+      <w:proofErr w:type="spellStart"/>
+      <w:r>
+        <w:t>pháp</w:t>
+      </w:r>
+      <w:proofErr w:type="spellEnd"/>
+      <w:r>
+        <w:t xml:space="preserve"> </w:t>
+      </w:r>
+      <w:proofErr w:type="spellStart"/>
+      <w:r>
+        <w:t>của</w:t>
+      </w:r>
+      <w:proofErr w:type="spellEnd"/>
+      <w:r>
+        <w:t xml:space="preserve"> </w:t>
+      </w:r>
+      <w:proofErr w:type="spellStart"/>
+      <w:r>
+        <w:t>các</w:t>
+      </w:r>
+      <w:proofErr w:type="spellEnd"/>
+      <w:r>
+        <w:t xml:space="preserve"> </w:t>
+      </w:r>
+      <w:proofErr w:type="spellStart"/>
+      <w:r>
+        <w:t>câu</w:t>
+      </w:r>
+      <w:proofErr w:type="spellEnd"/>
+      <w:r>
+        <w:t xml:space="preserve"> </w:t>
+      </w:r>
+      <w:proofErr w:type="spellStart"/>
+      <w:r>
+        <w:t>lệnh</w:t>
+      </w:r>
+      <w:proofErr w:type="spellEnd"/>
+      <w:r>
+        <w:t xml:space="preserve"> </w:t>
+      </w:r>
+      <w:proofErr w:type="spellStart"/>
+      <w:r>
+        <w:t>và</w:t>
+      </w:r>
+      <w:proofErr w:type="spellEnd"/>
+      <w:r>
+        <w:t xml:space="preserve"> </w:t>
+      </w:r>
+      <w:proofErr w:type="spellStart"/>
+      <w:r>
+        <w:t>cách</w:t>
+      </w:r>
+      <w:proofErr w:type="spellEnd"/>
+      <w:r>
+        <w:t xml:space="preserve"> </w:t>
+      </w:r>
+      <w:proofErr w:type="spellStart"/>
+      <w:r>
+        <w:t>dùng</w:t>
+      </w:r>
+      <w:proofErr w:type="spellEnd"/>
+      <w:r>
+        <w:t xml:space="preserve"> </w:t>
+      </w:r>
+      <w:proofErr w:type="spellStart"/>
+      <w:r>
+        <w:t>chúng</w:t>
+      </w:r>
+      <w:proofErr w:type="spellEnd"/>
+      <w:r>
+        <w:t xml:space="preserve"> </w:t>
+      </w:r>
+      <w:proofErr w:type="spellStart"/>
+      <w:r>
+        <w:t>cho</w:t>
+      </w:r>
+      <w:proofErr w:type="spellEnd"/>
+      <w:r>
+        <w:t xml:space="preserve"> </w:t>
+      </w:r>
+      <w:proofErr w:type="spellStart"/>
+      <w:r>
+        <w:t>các</w:t>
+      </w:r>
+      <w:proofErr w:type="spellEnd"/>
+      <w:r>
+        <w:t xml:space="preserve"> </w:t>
+      </w:r>
+      <w:proofErr w:type="spellStart"/>
+      <w:r>
+        <w:t>yêu</w:t>
+      </w:r>
+      <w:proofErr w:type="spellEnd"/>
+      <w:r>
+        <w:t xml:space="preserve"> </w:t>
+      </w:r>
+      <w:proofErr w:type="spellStart"/>
+      <w:r>
+        <w:t>cầu</w:t>
+      </w:r>
+      <w:proofErr w:type="spellEnd"/>
+      <w:r>
+        <w:t xml:space="preserve"> </w:t>
+      </w:r>
+      <w:proofErr w:type="spellStart"/>
+      <w:r>
+        <w:t>thực</w:t>
+      </w:r>
+      <w:proofErr w:type="spellEnd"/>
+      <w:r>
+        <w:t xml:space="preserve"> </w:t>
+      </w:r>
+      <w:proofErr w:type="spellStart"/>
+      <w:r>
+        <w:t>tế</w:t>
+      </w:r>
+      <w:proofErr w:type="spellEnd"/>
+      <w:r>
+        <w:t xml:space="preserve"> </w:t>
+      </w:r>
+      <w:proofErr w:type="spellStart"/>
+      <w:r>
+        <w:t>từ</w:t>
+      </w:r>
+      <w:proofErr w:type="spellEnd"/>
+      <w:r>
+        <w:t xml:space="preserve"> </w:t>
+      </w:r>
+      <w:proofErr w:type="spellStart"/>
+      <w:r>
+        <w:t>miniproject</w:t>
+      </w:r>
+      <w:proofErr w:type="spellEnd"/>
+      <w:r>
+        <w:t>.</w:t>
       </w:r>
     </w:p>
     <w:p>
@@ -301,48 +1730,558 @@
           <w:numId w:val="6"/>
         </w:numPr>
       </w:pPr>
-      <w:r>
-        <w:t xml:space="preserve">Áp dụng các </w:t>
-      </w:r>
+      <w:proofErr w:type="spellStart"/>
+      <w:r>
+        <w:t>Áp</w:t>
+      </w:r>
+      <w:proofErr w:type="spellEnd"/>
+      <w:r>
+        <w:t xml:space="preserve"> </w:t>
+      </w:r>
+      <w:proofErr w:type="spellStart"/>
+      <w:r>
+        <w:t>dụng</w:t>
+      </w:r>
+      <w:proofErr w:type="spellEnd"/>
+      <w:r>
+        <w:t xml:space="preserve"> </w:t>
+      </w:r>
+      <w:proofErr w:type="spellStart"/>
+      <w:r>
+        <w:t>các</w:t>
+      </w:r>
+      <w:proofErr w:type="spellEnd"/>
+      <w:r>
+        <w:t xml:space="preserve"> </w:t>
+      </w:r>
+      <w:proofErr w:type="spellStart"/>
       <w:r>
         <w:t>lệnh</w:t>
       </w:r>
-      <w:r>
-        <w:t xml:space="preserve"> vào thực tế?</w:t>
+      <w:proofErr w:type="spellEnd"/>
+      <w:r>
+        <w:t xml:space="preserve"> </w:t>
+      </w:r>
+      <w:proofErr w:type="spellStart"/>
+      <w:r>
+        <w:t>vào</w:t>
+      </w:r>
+      <w:proofErr w:type="spellEnd"/>
+      <w:r>
+        <w:t xml:space="preserve"> </w:t>
+      </w:r>
+      <w:proofErr w:type="spellStart"/>
+      <w:r>
+        <w:t>thực</w:t>
+      </w:r>
+      <w:proofErr w:type="spellEnd"/>
+      <w:r>
+        <w:t xml:space="preserve"> </w:t>
+      </w:r>
+      <w:proofErr w:type="spellStart"/>
+      <w:r>
+        <w:t>tế</w:t>
+      </w:r>
+      <w:proofErr w:type="spellEnd"/>
+      <w:r>
+        <w:t>?</w:t>
       </w:r>
     </w:p>
     <w:p>
-      <w:r>
-        <w:t>Lệnh CREATE: Dùng để tạo cơ sở dữ liệu và bảng</w:t>
-      </w:r>
+      <w:proofErr w:type="spellStart"/>
+      <w:r>
+        <w:t>Lệnh</w:t>
+      </w:r>
+      <w:proofErr w:type="spellEnd"/>
+      <w:r>
+        <w:t xml:space="preserve"> CREATE: </w:t>
+      </w:r>
+      <w:proofErr w:type="spellStart"/>
+      <w:r>
+        <w:t>Dùng</w:t>
+      </w:r>
+      <w:proofErr w:type="spellEnd"/>
+      <w:r>
+        <w:t xml:space="preserve"> </w:t>
+      </w:r>
+      <w:proofErr w:type="spellStart"/>
+      <w:r>
+        <w:t>để</w:t>
+      </w:r>
+      <w:proofErr w:type="spellEnd"/>
+      <w:r>
+        <w:t xml:space="preserve"> </w:t>
+      </w:r>
+      <w:proofErr w:type="spellStart"/>
+      <w:r>
+        <w:t>tạo</w:t>
+      </w:r>
+      <w:proofErr w:type="spellEnd"/>
+      <w:r>
+        <w:t xml:space="preserve"> </w:t>
+      </w:r>
+      <w:proofErr w:type="spellStart"/>
+      <w:r>
+        <w:t>cơ</w:t>
+      </w:r>
+      <w:proofErr w:type="spellEnd"/>
+      <w:r>
+        <w:t xml:space="preserve"> </w:t>
+      </w:r>
+      <w:proofErr w:type="spellStart"/>
+      <w:r>
+        <w:t>sở</w:t>
+      </w:r>
+      <w:proofErr w:type="spellEnd"/>
+      <w:r>
+        <w:t xml:space="preserve"> </w:t>
+      </w:r>
+      <w:proofErr w:type="spellStart"/>
+      <w:r>
+        <w:t>dữ</w:t>
+      </w:r>
+      <w:proofErr w:type="spellEnd"/>
+      <w:r>
+        <w:t xml:space="preserve"> </w:t>
+      </w:r>
+      <w:proofErr w:type="spellStart"/>
+      <w:r>
+        <w:t>liệu</w:t>
+      </w:r>
+      <w:proofErr w:type="spellEnd"/>
+      <w:r>
+        <w:t xml:space="preserve"> </w:t>
+      </w:r>
+      <w:proofErr w:type="spellStart"/>
+      <w:r>
+        <w:t>và</w:t>
+      </w:r>
+      <w:proofErr w:type="spellEnd"/>
+      <w:r>
+        <w:t xml:space="preserve"> </w:t>
+      </w:r>
+      <w:proofErr w:type="spellStart"/>
+      <w:r>
+        <w:t>bảng</w:t>
+      </w:r>
+      <w:proofErr w:type="spellEnd"/>
     </w:p>
     <w:p>
-      <w:r>
-        <w:t xml:space="preserve">Lệnh DROP: Dùng để xóa cơ sở dữ liệu </w:t>
-      </w:r>
-      <w:r>
-        <w:t>và bảng</w:t>
-      </w:r>
+      <w:proofErr w:type="spellStart"/>
+      <w:r>
+        <w:t>Lệnh</w:t>
+      </w:r>
+      <w:proofErr w:type="spellEnd"/>
+      <w:r>
+        <w:t xml:space="preserve"> DROP: </w:t>
+      </w:r>
+      <w:proofErr w:type="spellStart"/>
+      <w:r>
+        <w:t>Dùng</w:t>
+      </w:r>
+      <w:proofErr w:type="spellEnd"/>
+      <w:r>
+        <w:t xml:space="preserve"> </w:t>
+      </w:r>
+      <w:proofErr w:type="spellStart"/>
+      <w:r>
+        <w:t>để</w:t>
+      </w:r>
+      <w:proofErr w:type="spellEnd"/>
+      <w:r>
+        <w:t xml:space="preserve"> </w:t>
+      </w:r>
+      <w:proofErr w:type="spellStart"/>
+      <w:r>
+        <w:t>xóa</w:t>
+      </w:r>
+      <w:proofErr w:type="spellEnd"/>
+      <w:r>
+        <w:t xml:space="preserve"> </w:t>
+      </w:r>
+      <w:proofErr w:type="spellStart"/>
+      <w:r>
+        <w:t>cơ</w:t>
+      </w:r>
+      <w:proofErr w:type="spellEnd"/>
+      <w:r>
+        <w:t xml:space="preserve"> </w:t>
+      </w:r>
+      <w:proofErr w:type="spellStart"/>
+      <w:r>
+        <w:t>sở</w:t>
+      </w:r>
+      <w:proofErr w:type="spellEnd"/>
+      <w:r>
+        <w:t xml:space="preserve"> </w:t>
+      </w:r>
+      <w:proofErr w:type="spellStart"/>
+      <w:r>
+        <w:t>dữ</w:t>
+      </w:r>
+      <w:proofErr w:type="spellEnd"/>
+      <w:r>
+        <w:t xml:space="preserve"> </w:t>
+      </w:r>
+      <w:proofErr w:type="spellStart"/>
+      <w:r>
+        <w:t>liệu</w:t>
+      </w:r>
+      <w:proofErr w:type="spellEnd"/>
+      <w:r>
+        <w:t xml:space="preserve"> </w:t>
+      </w:r>
+      <w:proofErr w:type="spellStart"/>
+      <w:r>
+        <w:t>và</w:t>
+      </w:r>
+      <w:proofErr w:type="spellEnd"/>
+      <w:r>
+        <w:t xml:space="preserve"> </w:t>
+      </w:r>
+      <w:proofErr w:type="spellStart"/>
+      <w:r>
+        <w:t>bảng</w:t>
+      </w:r>
+      <w:proofErr w:type="spellEnd"/>
     </w:p>
     <w:p>
-      <w:r>
-        <w:t>Lệnh ALTER: Với các từ khóa add để thêm cột kiểu dữ liệu và thuộc tính modify dùng để sửa cột và drop dùng để xóa ràng buộc.</w:t>
+      <w:proofErr w:type="spellStart"/>
+      <w:r>
+        <w:t>Lệnh</w:t>
+      </w:r>
+      <w:proofErr w:type="spellEnd"/>
+      <w:r>
+        <w:t xml:space="preserve"> ALTER: </w:t>
+      </w:r>
+      <w:proofErr w:type="spellStart"/>
+      <w:r>
+        <w:t>Với</w:t>
+      </w:r>
+      <w:proofErr w:type="spellEnd"/>
+      <w:r>
+        <w:t xml:space="preserve"> </w:t>
+      </w:r>
+      <w:proofErr w:type="spellStart"/>
+      <w:r>
+        <w:t>các</w:t>
+      </w:r>
+      <w:proofErr w:type="spellEnd"/>
+      <w:r>
+        <w:t xml:space="preserve"> </w:t>
+      </w:r>
+      <w:proofErr w:type="spellStart"/>
+      <w:r>
+        <w:t>từ</w:t>
+      </w:r>
+      <w:proofErr w:type="spellEnd"/>
+      <w:r>
+        <w:t xml:space="preserve"> </w:t>
+      </w:r>
+      <w:proofErr w:type="spellStart"/>
+      <w:r>
+        <w:t>khóa</w:t>
+      </w:r>
+      <w:proofErr w:type="spellEnd"/>
+      <w:r>
+        <w:t xml:space="preserve"> add </w:t>
+      </w:r>
+      <w:proofErr w:type="spellStart"/>
+      <w:r>
+        <w:t>để</w:t>
+      </w:r>
+      <w:proofErr w:type="spellEnd"/>
+      <w:r>
+        <w:t xml:space="preserve"> </w:t>
+      </w:r>
+      <w:proofErr w:type="spellStart"/>
+      <w:r>
+        <w:t>thêm</w:t>
+      </w:r>
+      <w:proofErr w:type="spellEnd"/>
+      <w:r>
+        <w:t xml:space="preserve"> </w:t>
+      </w:r>
+      <w:proofErr w:type="spellStart"/>
+      <w:r>
+        <w:t>cột</w:t>
+      </w:r>
+      <w:proofErr w:type="spellEnd"/>
+      <w:r>
+        <w:t xml:space="preserve"> </w:t>
+      </w:r>
+      <w:proofErr w:type="spellStart"/>
+      <w:r>
+        <w:t>kiểu</w:t>
+      </w:r>
+      <w:proofErr w:type="spellEnd"/>
+      <w:r>
+        <w:t xml:space="preserve"> </w:t>
+      </w:r>
+      <w:proofErr w:type="spellStart"/>
+      <w:r>
+        <w:t>dữ</w:t>
+      </w:r>
+      <w:proofErr w:type="spellEnd"/>
+      <w:r>
+        <w:t xml:space="preserve"> </w:t>
+      </w:r>
+      <w:proofErr w:type="spellStart"/>
+      <w:r>
+        <w:t>liệu</w:t>
+      </w:r>
+      <w:proofErr w:type="spellEnd"/>
+      <w:r>
+        <w:t xml:space="preserve"> </w:t>
+      </w:r>
+      <w:proofErr w:type="spellStart"/>
+      <w:r>
+        <w:t>và</w:t>
+      </w:r>
+      <w:proofErr w:type="spellEnd"/>
+      <w:r>
+        <w:t xml:space="preserve"> </w:t>
+      </w:r>
+      <w:proofErr w:type="spellStart"/>
+      <w:r>
+        <w:t>thuộc</w:t>
+      </w:r>
+      <w:proofErr w:type="spellEnd"/>
+      <w:r>
+        <w:t xml:space="preserve"> </w:t>
+      </w:r>
+      <w:proofErr w:type="spellStart"/>
+      <w:r>
+        <w:t>tính</w:t>
+      </w:r>
+      <w:proofErr w:type="spellEnd"/>
+      <w:r>
+        <w:t xml:space="preserve"> modify </w:t>
+      </w:r>
+      <w:proofErr w:type="spellStart"/>
+      <w:r>
+        <w:t>dùng</w:t>
+      </w:r>
+      <w:proofErr w:type="spellEnd"/>
+      <w:r>
+        <w:t xml:space="preserve"> </w:t>
+      </w:r>
+      <w:proofErr w:type="spellStart"/>
+      <w:r>
+        <w:t>để</w:t>
+      </w:r>
+      <w:proofErr w:type="spellEnd"/>
+      <w:r>
+        <w:t xml:space="preserve"> </w:t>
+      </w:r>
+      <w:proofErr w:type="spellStart"/>
+      <w:r>
+        <w:t>sửa</w:t>
+      </w:r>
+      <w:proofErr w:type="spellEnd"/>
+      <w:r>
+        <w:t xml:space="preserve"> </w:t>
+      </w:r>
+      <w:proofErr w:type="spellStart"/>
+      <w:r>
+        <w:t>cột</w:t>
+      </w:r>
+      <w:proofErr w:type="spellEnd"/>
+      <w:r>
+        <w:t xml:space="preserve"> </w:t>
+      </w:r>
+      <w:proofErr w:type="spellStart"/>
+      <w:r>
+        <w:t>và</w:t>
+      </w:r>
+      <w:proofErr w:type="spellEnd"/>
+      <w:r>
+        <w:t xml:space="preserve"> drop </w:t>
+      </w:r>
+      <w:proofErr w:type="spellStart"/>
+      <w:r>
+        <w:t>dùng</w:t>
+      </w:r>
+      <w:proofErr w:type="spellEnd"/>
+      <w:r>
+        <w:t xml:space="preserve"> </w:t>
+      </w:r>
+      <w:proofErr w:type="spellStart"/>
+      <w:r>
+        <w:t>để</w:t>
+      </w:r>
+      <w:proofErr w:type="spellEnd"/>
+      <w:r>
+        <w:t xml:space="preserve"> </w:t>
+      </w:r>
+      <w:proofErr w:type="spellStart"/>
+      <w:r>
+        <w:t>xóa</w:t>
+      </w:r>
+      <w:proofErr w:type="spellEnd"/>
+      <w:r>
+        <w:t xml:space="preserve"> </w:t>
+      </w:r>
+      <w:proofErr w:type="spellStart"/>
+      <w:r>
+        <w:t>ràng</w:t>
+      </w:r>
+      <w:proofErr w:type="spellEnd"/>
+      <w:r>
+        <w:t xml:space="preserve"> </w:t>
+      </w:r>
+      <w:proofErr w:type="spellStart"/>
+      <w:r>
+        <w:t>buộc</w:t>
+      </w:r>
+      <w:proofErr w:type="spellEnd"/>
+      <w:r>
+        <w:t>.</w:t>
       </w:r>
     </w:p>
     <w:p>
-      <w:r>
-        <w:t>Lệnh INSERT: Dùng để thêm dữ liệu</w:t>
-      </w:r>
+      <w:proofErr w:type="spellStart"/>
+      <w:r>
+        <w:t>Lệnh</w:t>
+      </w:r>
+      <w:proofErr w:type="spellEnd"/>
+      <w:r>
+        <w:t xml:space="preserve"> INSERT: </w:t>
+      </w:r>
+      <w:proofErr w:type="spellStart"/>
+      <w:r>
+        <w:t>Dùng</w:t>
+      </w:r>
+      <w:proofErr w:type="spellEnd"/>
+      <w:r>
+        <w:t xml:space="preserve"> </w:t>
+      </w:r>
+      <w:proofErr w:type="spellStart"/>
+      <w:r>
+        <w:t>để</w:t>
+      </w:r>
+      <w:proofErr w:type="spellEnd"/>
+      <w:r>
+        <w:t xml:space="preserve"> </w:t>
+      </w:r>
+      <w:proofErr w:type="spellStart"/>
+      <w:r>
+        <w:t>thêm</w:t>
+      </w:r>
+      <w:proofErr w:type="spellEnd"/>
+      <w:r>
+        <w:t xml:space="preserve"> </w:t>
+      </w:r>
+      <w:proofErr w:type="spellStart"/>
+      <w:r>
+        <w:t>dữ</w:t>
+      </w:r>
+      <w:proofErr w:type="spellEnd"/>
+      <w:r>
+        <w:t xml:space="preserve"> </w:t>
+      </w:r>
+      <w:proofErr w:type="spellStart"/>
+      <w:r>
+        <w:t>liệu</w:t>
+      </w:r>
+      <w:proofErr w:type="spellEnd"/>
     </w:p>
     <w:p>
-      <w:r>
-        <w:t>Lệnh UPDATE: Dùng để cập nhật dữ lieu</w:t>
+      <w:proofErr w:type="spellStart"/>
+      <w:r>
+        <w:t>Lệnh</w:t>
+      </w:r>
+      <w:proofErr w:type="spellEnd"/>
+      <w:r>
+        <w:t xml:space="preserve"> UPDATE: </w:t>
+      </w:r>
+      <w:proofErr w:type="spellStart"/>
+      <w:r>
+        <w:t>Dùng</w:t>
+      </w:r>
+      <w:proofErr w:type="spellEnd"/>
+      <w:r>
+        <w:t xml:space="preserve"> </w:t>
+      </w:r>
+      <w:proofErr w:type="spellStart"/>
+      <w:r>
+        <w:t>để</w:t>
+      </w:r>
+      <w:proofErr w:type="spellEnd"/>
+      <w:r>
+        <w:t xml:space="preserve"> </w:t>
+      </w:r>
+      <w:proofErr w:type="spellStart"/>
+      <w:r>
+        <w:t>cập</w:t>
+      </w:r>
+      <w:proofErr w:type="spellEnd"/>
+      <w:r>
+        <w:t xml:space="preserve"> </w:t>
+      </w:r>
+      <w:proofErr w:type="spellStart"/>
+      <w:r>
+        <w:t>nhật</w:t>
+      </w:r>
+      <w:proofErr w:type="spellEnd"/>
+      <w:r>
+        <w:t xml:space="preserve"> </w:t>
+      </w:r>
+      <w:proofErr w:type="spellStart"/>
+      <w:r>
+        <w:t>dữ</w:t>
+      </w:r>
+      <w:proofErr w:type="spellEnd"/>
+      <w:r>
+        <w:t xml:space="preserve"> lieu</w:t>
       </w:r>
     </w:p>
     <w:p>
-      <w:r>
-        <w:t>Lệnh DELETE: Dùng để xóa dữ liệu</w:t>
-      </w:r>
+      <w:proofErr w:type="spellStart"/>
+      <w:r>
+        <w:t>Lệnh</w:t>
+      </w:r>
+      <w:proofErr w:type="spellEnd"/>
+      <w:r>
+        <w:t xml:space="preserve"> DELETE: </w:t>
+      </w:r>
+      <w:proofErr w:type="spellStart"/>
+      <w:r>
+        <w:t>Dùng</w:t>
+      </w:r>
+      <w:proofErr w:type="spellEnd"/>
+      <w:r>
+        <w:t xml:space="preserve"> </w:t>
+      </w:r>
+      <w:proofErr w:type="spellStart"/>
+      <w:r>
+        <w:t>để</w:t>
+      </w:r>
+      <w:proofErr w:type="spellEnd"/>
+      <w:r>
+        <w:t xml:space="preserve"> </w:t>
+      </w:r>
+      <w:proofErr w:type="spellStart"/>
+      <w:r>
+        <w:t>xóa</w:t>
+      </w:r>
+      <w:proofErr w:type="spellEnd"/>
+      <w:r>
+        <w:t xml:space="preserve"> </w:t>
+      </w:r>
+      <w:proofErr w:type="spellStart"/>
+      <w:r>
+        <w:t>dữ</w:t>
+      </w:r>
+      <w:proofErr w:type="spellEnd"/>
+      <w:r>
+        <w:t xml:space="preserve"> </w:t>
+      </w:r>
+      <w:proofErr w:type="spellStart"/>
+      <w:r>
+        <w:t>liệu</w:t>
+      </w:r>
+      <w:proofErr w:type="spellEnd"/>
     </w:p>
     <w:p>
       <w:pPr>
@@ -352,16 +2291,263 @@
         </w:numPr>
       </w:pPr>
       <w:r>
-        <w:t>Hoàn thành bài thực hành đúng yêu cầu hay chưa?</w:t>
+        <w:t xml:space="preserve">Hoàn </w:t>
+      </w:r>
+      <w:proofErr w:type="spellStart"/>
+      <w:r>
+        <w:t>thành</w:t>
+      </w:r>
+      <w:proofErr w:type="spellEnd"/>
+      <w:r>
+        <w:t xml:space="preserve"> </w:t>
+      </w:r>
+      <w:proofErr w:type="spellStart"/>
+      <w:r>
+        <w:t>bài</w:t>
+      </w:r>
+      <w:proofErr w:type="spellEnd"/>
+      <w:r>
+        <w:t xml:space="preserve"> </w:t>
+      </w:r>
+      <w:proofErr w:type="spellStart"/>
+      <w:r>
+        <w:t>thực</w:t>
+      </w:r>
+      <w:proofErr w:type="spellEnd"/>
+      <w:r>
+        <w:t xml:space="preserve"> </w:t>
+      </w:r>
+      <w:proofErr w:type="spellStart"/>
+      <w:r>
+        <w:t>hành</w:t>
+      </w:r>
+      <w:proofErr w:type="spellEnd"/>
+      <w:r>
+        <w:t xml:space="preserve"> </w:t>
+      </w:r>
+      <w:proofErr w:type="spellStart"/>
+      <w:r>
+        <w:t>đúng</w:t>
+      </w:r>
+      <w:proofErr w:type="spellEnd"/>
+      <w:r>
+        <w:t xml:space="preserve"> </w:t>
+      </w:r>
+      <w:proofErr w:type="spellStart"/>
+      <w:r>
+        <w:t>yêu</w:t>
+      </w:r>
+      <w:proofErr w:type="spellEnd"/>
+      <w:r>
+        <w:t xml:space="preserve"> </w:t>
+      </w:r>
+      <w:proofErr w:type="spellStart"/>
+      <w:r>
+        <w:t>cầu</w:t>
+      </w:r>
+      <w:proofErr w:type="spellEnd"/>
+      <w:r>
+        <w:t xml:space="preserve"> hay </w:t>
+      </w:r>
+      <w:proofErr w:type="spellStart"/>
+      <w:r>
+        <w:t>chưa</w:t>
+      </w:r>
+      <w:proofErr w:type="spellEnd"/>
+      <w:r>
+        <w:t>?</w:t>
       </w:r>
     </w:p>
     <w:p>
-      <w:r>
-        <w:t>Nhóm em đã hoàn thành đúng yêu cầu</w:t>
-      </w:r>
-      <w:r>
-        <w:t>. Tuy nhiên bản thân em cần cải thiện về việc đưa ra kiểu dữ liệu phù hợp</w:t>
-      </w:r>
+      <w:proofErr w:type="spellStart"/>
+      <w:r>
+        <w:t>Nhóm</w:t>
+      </w:r>
+      <w:proofErr w:type="spellEnd"/>
+      <w:r>
+        <w:t xml:space="preserve"> </w:t>
+      </w:r>
+      <w:proofErr w:type="spellStart"/>
+      <w:r>
+        <w:t>em</w:t>
+      </w:r>
+      <w:proofErr w:type="spellEnd"/>
+      <w:r>
+        <w:t xml:space="preserve"> </w:t>
+      </w:r>
+      <w:proofErr w:type="spellStart"/>
+      <w:r>
+        <w:t>đã</w:t>
+      </w:r>
+      <w:proofErr w:type="spellEnd"/>
+      <w:r>
+        <w:t xml:space="preserve"> </w:t>
+      </w:r>
+      <w:proofErr w:type="spellStart"/>
+      <w:r>
+        <w:t>hoàn</w:t>
+      </w:r>
+      <w:proofErr w:type="spellEnd"/>
+      <w:r>
+        <w:t xml:space="preserve"> </w:t>
+      </w:r>
+      <w:proofErr w:type="spellStart"/>
+      <w:r>
+        <w:t>thành</w:t>
+      </w:r>
+      <w:proofErr w:type="spellEnd"/>
+      <w:r>
+        <w:t xml:space="preserve"> </w:t>
+      </w:r>
+      <w:proofErr w:type="spellStart"/>
+      <w:r>
+        <w:t>đúng</w:t>
+      </w:r>
+      <w:proofErr w:type="spellEnd"/>
+      <w:r>
+        <w:t xml:space="preserve"> </w:t>
+      </w:r>
+      <w:proofErr w:type="spellStart"/>
+      <w:r>
+        <w:t>yêu</w:t>
+      </w:r>
+      <w:proofErr w:type="spellEnd"/>
+      <w:r>
+        <w:t xml:space="preserve"> </w:t>
+      </w:r>
+      <w:proofErr w:type="spellStart"/>
+      <w:r>
+        <w:t>cầu</w:t>
+      </w:r>
+      <w:proofErr w:type="spellEnd"/>
+      <w:r>
+        <w:t xml:space="preserve">. Tuy </w:t>
+      </w:r>
+      <w:proofErr w:type="spellStart"/>
+      <w:r>
+        <w:t>nhiên</w:t>
+      </w:r>
+      <w:proofErr w:type="spellEnd"/>
+      <w:r>
+        <w:t xml:space="preserve"> </w:t>
+      </w:r>
+      <w:proofErr w:type="spellStart"/>
+      <w:r>
+        <w:t>bản</w:t>
+      </w:r>
+      <w:proofErr w:type="spellEnd"/>
+      <w:r>
+        <w:t xml:space="preserve"> </w:t>
+      </w:r>
+      <w:proofErr w:type="spellStart"/>
+      <w:r>
+        <w:t>thân</w:t>
+      </w:r>
+      <w:proofErr w:type="spellEnd"/>
+      <w:r>
+        <w:t xml:space="preserve"> </w:t>
+      </w:r>
+      <w:proofErr w:type="spellStart"/>
+      <w:r>
+        <w:t>em</w:t>
+      </w:r>
+      <w:proofErr w:type="spellEnd"/>
+      <w:r>
+        <w:t xml:space="preserve"> </w:t>
+      </w:r>
+      <w:proofErr w:type="spellStart"/>
+      <w:r>
+        <w:t>cần</w:t>
+      </w:r>
+      <w:proofErr w:type="spellEnd"/>
+      <w:r>
+        <w:t xml:space="preserve"> </w:t>
+      </w:r>
+      <w:proofErr w:type="spellStart"/>
+      <w:r>
+        <w:t>cải</w:t>
+      </w:r>
+      <w:proofErr w:type="spellEnd"/>
+      <w:r>
+        <w:t xml:space="preserve"> </w:t>
+      </w:r>
+      <w:proofErr w:type="spellStart"/>
+      <w:r>
+        <w:t>thiện</w:t>
+      </w:r>
+      <w:proofErr w:type="spellEnd"/>
+      <w:r>
+        <w:t xml:space="preserve"> </w:t>
+      </w:r>
+      <w:proofErr w:type="spellStart"/>
+      <w:r>
+        <w:t>về</w:t>
+      </w:r>
+      <w:proofErr w:type="spellEnd"/>
+      <w:r>
+        <w:t xml:space="preserve"> </w:t>
+      </w:r>
+      <w:proofErr w:type="spellStart"/>
+      <w:r>
+        <w:t>việc</w:t>
+      </w:r>
+      <w:proofErr w:type="spellEnd"/>
+      <w:r>
+        <w:t xml:space="preserve"> </w:t>
+      </w:r>
+      <w:proofErr w:type="spellStart"/>
+      <w:r>
+        <w:t>đưa</w:t>
+      </w:r>
+      <w:proofErr w:type="spellEnd"/>
+      <w:r>
+        <w:t xml:space="preserve"> </w:t>
+      </w:r>
+      <w:proofErr w:type="spellStart"/>
+      <w:r>
+        <w:t>ra</w:t>
+      </w:r>
+      <w:proofErr w:type="spellEnd"/>
+      <w:r>
+        <w:t xml:space="preserve"> </w:t>
+      </w:r>
+      <w:proofErr w:type="spellStart"/>
+      <w:r>
+        <w:t>kiểu</w:t>
+      </w:r>
+      <w:proofErr w:type="spellEnd"/>
+      <w:r>
+        <w:t xml:space="preserve"> </w:t>
+      </w:r>
+      <w:proofErr w:type="spellStart"/>
+      <w:r>
+        <w:t>dữ</w:t>
+      </w:r>
+      <w:proofErr w:type="spellEnd"/>
+      <w:r>
+        <w:t xml:space="preserve"> </w:t>
+      </w:r>
+      <w:proofErr w:type="spellStart"/>
+      <w:r>
+        <w:t>liệu</w:t>
+      </w:r>
+      <w:proofErr w:type="spellEnd"/>
+      <w:r>
+        <w:t xml:space="preserve"> </w:t>
+      </w:r>
+      <w:proofErr w:type="spellStart"/>
+      <w:r>
+        <w:t>phù</w:t>
+      </w:r>
+      <w:proofErr w:type="spellEnd"/>
+      <w:r>
+        <w:t xml:space="preserve"> </w:t>
+      </w:r>
+      <w:proofErr w:type="spellStart"/>
+      <w:r>
+        <w:t>hợp</w:t>
+      </w:r>
+      <w:proofErr w:type="spellEnd"/>
     </w:p>
     <w:p>
       <w:pPr>
@@ -370,14 +2556,115 @@
           <w:numId w:val="6"/>
         </w:numPr>
       </w:pPr>
-      <w:r>
-        <w:t>Đã giúp các em nâng cao kỹ năng thao tác vớ</w:t>
-      </w:r>
-      <w:r>
-        <w:t>i DDL và DML</w:t>
-      </w:r>
-      <w:r>
-        <w:t xml:space="preserve"> hay chưa?</w:t>
+      <w:proofErr w:type="spellStart"/>
+      <w:r>
+        <w:t>Đã</w:t>
+      </w:r>
+      <w:proofErr w:type="spellEnd"/>
+      <w:r>
+        <w:t xml:space="preserve"> </w:t>
+      </w:r>
+      <w:proofErr w:type="spellStart"/>
+      <w:r>
+        <w:t>giúp</w:t>
+      </w:r>
+      <w:proofErr w:type="spellEnd"/>
+      <w:r>
+        <w:t xml:space="preserve"> </w:t>
+      </w:r>
+      <w:proofErr w:type="spellStart"/>
+      <w:r>
+        <w:t>các</w:t>
+      </w:r>
+      <w:proofErr w:type="spellEnd"/>
+      <w:r>
+        <w:t xml:space="preserve"> </w:t>
+      </w:r>
+      <w:proofErr w:type="spellStart"/>
+      <w:r>
+        <w:t>em</w:t>
+      </w:r>
+      <w:proofErr w:type="spellEnd"/>
+      <w:r>
+        <w:t xml:space="preserve"> </w:t>
+      </w:r>
+      <w:proofErr w:type="spellStart"/>
+      <w:r>
+        <w:t>nâng</w:t>
+      </w:r>
+      <w:proofErr w:type="spellEnd"/>
+      <w:r>
+        <w:t xml:space="preserve"> </w:t>
+      </w:r>
+      <w:proofErr w:type="spellStart"/>
+      <w:r>
+        <w:t>cao</w:t>
+      </w:r>
+      <w:proofErr w:type="spellEnd"/>
+      <w:r>
+        <w:t xml:space="preserve"> </w:t>
+      </w:r>
+      <w:proofErr w:type="spellStart"/>
+      <w:r>
+        <w:t>kỹ</w:t>
+      </w:r>
+      <w:proofErr w:type="spellEnd"/>
+      <w:r>
+        <w:t xml:space="preserve"> </w:t>
+      </w:r>
+      <w:proofErr w:type="spellStart"/>
+      <w:r>
+        <w:t>năng</w:t>
+      </w:r>
+      <w:proofErr w:type="spellEnd"/>
+      <w:r>
+        <w:t xml:space="preserve"> </w:t>
+      </w:r>
+      <w:proofErr w:type="spellStart"/>
+      <w:r>
+        <w:t>thao</w:t>
+      </w:r>
+      <w:proofErr w:type="spellEnd"/>
+      <w:r>
+        <w:t xml:space="preserve"> </w:t>
+      </w:r>
+      <w:proofErr w:type="spellStart"/>
+      <w:r>
+        <w:t>tác</w:t>
+      </w:r>
+      <w:proofErr w:type="spellEnd"/>
+      <w:r>
+        <w:t xml:space="preserve"> </w:t>
+      </w:r>
+      <w:proofErr w:type="spellStart"/>
+      <w:r>
+        <w:t>vớ</w:t>
+      </w:r>
+      <w:r>
+        <w:t>i</w:t>
+      </w:r>
+      <w:proofErr w:type="spellEnd"/>
+      <w:r>
+        <w:t xml:space="preserve"> DDL </w:t>
+      </w:r>
+      <w:proofErr w:type="spellStart"/>
+      <w:r>
+        <w:t>và</w:t>
+      </w:r>
+      <w:proofErr w:type="spellEnd"/>
+      <w:r>
+        <w:t xml:space="preserve"> DML</w:t>
+      </w:r>
+      <w:r>
+        <w:t xml:space="preserve"> hay </w:t>
+      </w:r>
+      <w:proofErr w:type="spellStart"/>
+      <w:r>
+        <w:t>chưa</w:t>
+      </w:r>
+      <w:proofErr w:type="spellEnd"/>
+      <w:r>
+        <w:t>?</w:t>
       </w:r>
     </w:p>
     <w:p>
@@ -385,8 +2672,133 @@
         <w:t>Em</w:t>
       </w:r>
       <w:r>
-        <w:t xml:space="preserve"> cảm thấy em đã tiến bộ hơn trong việc sử dụng các nhóm lệnh cơ bản</w:t>
-      </w:r>
+        <w:t xml:space="preserve"> </w:t>
+      </w:r>
+      <w:proofErr w:type="spellStart"/>
+      <w:r>
+        <w:t>cảm</w:t>
+      </w:r>
+      <w:proofErr w:type="spellEnd"/>
+      <w:r>
+        <w:t xml:space="preserve"> </w:t>
+      </w:r>
+      <w:proofErr w:type="spellStart"/>
+      <w:r>
+        <w:t>thấy</w:t>
+      </w:r>
+      <w:proofErr w:type="spellEnd"/>
+      <w:r>
+        <w:t xml:space="preserve"> </w:t>
+      </w:r>
+      <w:proofErr w:type="spellStart"/>
+      <w:r>
+        <w:t>em</w:t>
+      </w:r>
+      <w:proofErr w:type="spellEnd"/>
+      <w:r>
+        <w:t xml:space="preserve"> </w:t>
+      </w:r>
+      <w:proofErr w:type="spellStart"/>
+      <w:r>
+        <w:t>đã</w:t>
+      </w:r>
+      <w:proofErr w:type="spellEnd"/>
+      <w:r>
+        <w:t xml:space="preserve"> </w:t>
+      </w:r>
+      <w:proofErr w:type="spellStart"/>
+      <w:r>
+        <w:t>tiến</w:t>
+      </w:r>
+      <w:proofErr w:type="spellEnd"/>
+      <w:r>
+        <w:t xml:space="preserve"> </w:t>
+      </w:r>
+      <w:proofErr w:type="spellStart"/>
+      <w:r>
+        <w:t>bộ</w:t>
+      </w:r>
+      <w:proofErr w:type="spellEnd"/>
+      <w:r>
+        <w:t xml:space="preserve"> </w:t>
+      </w:r>
+      <w:proofErr w:type="spellStart"/>
+      <w:r>
+        <w:t>hơn</w:t>
+      </w:r>
+      <w:proofErr w:type="spellEnd"/>
+      <w:r>
+        <w:t xml:space="preserve"> </w:t>
+      </w:r>
+      <w:proofErr w:type="spellStart"/>
+      <w:r>
+        <w:t>trong</w:t>
+      </w:r>
+      <w:proofErr w:type="spellEnd"/>
+      <w:r>
+        <w:t xml:space="preserve"> </w:t>
+      </w:r>
+      <w:proofErr w:type="spellStart"/>
+      <w:r>
+        <w:t>việc</w:t>
+      </w:r>
+      <w:proofErr w:type="spellEnd"/>
+      <w:r>
+        <w:t xml:space="preserve"> </w:t>
+      </w:r>
+      <w:proofErr w:type="spellStart"/>
+      <w:r>
+        <w:t>sử</w:t>
+      </w:r>
+      <w:proofErr w:type="spellEnd"/>
+      <w:r>
+        <w:t xml:space="preserve"> </w:t>
+      </w:r>
+      <w:proofErr w:type="spellStart"/>
+      <w:r>
+        <w:t>dụng</w:t>
+      </w:r>
+      <w:proofErr w:type="spellEnd"/>
+      <w:r>
+        <w:t xml:space="preserve"> </w:t>
+      </w:r>
+      <w:proofErr w:type="spellStart"/>
+      <w:r>
+        <w:t>các</w:t>
+      </w:r>
+      <w:proofErr w:type="spellEnd"/>
+      <w:r>
+        <w:t xml:space="preserve"> </w:t>
+      </w:r>
+      <w:proofErr w:type="spellStart"/>
+      <w:r>
+        <w:t>nhóm</w:t>
+      </w:r>
+      <w:proofErr w:type="spellEnd"/>
+      <w:r>
+        <w:t xml:space="preserve"> </w:t>
+      </w:r>
+      <w:proofErr w:type="spellStart"/>
+      <w:r>
+        <w:t>lệnh</w:t>
+      </w:r>
+      <w:proofErr w:type="spellEnd"/>
+      <w:r>
+        <w:t xml:space="preserve"> </w:t>
+      </w:r>
+      <w:proofErr w:type="spellStart"/>
+      <w:r>
+        <w:t>cơ</w:t>
+      </w:r>
+      <w:proofErr w:type="spellEnd"/>
+      <w:r>
+        <w:t xml:space="preserve"> </w:t>
+      </w:r>
+      <w:proofErr w:type="spellStart"/>
+      <w:r>
+        <w:t>bản</w:t>
+      </w:r>
+      <w:proofErr w:type="spellEnd"/>
     </w:p>
     <w:p>
       <w:r>
@@ -396,8 +2808,40 @@
           <w:i/>
           <w:iCs/>
         </w:rPr>
-        <w:t>Link mini-project: https://git.rikkei.edu.vn/it-103b-ks25/session4/miniproject</w:t>
-      </w:r>
+        <w:t xml:space="preserve">Link </w:t>
+      </w:r>
+      <w:proofErr w:type="gramStart"/>
+      <w:r>
+        <w:rPr>
+          <w:b/>
+          <w:bCs/>
+          <w:i/>
+          <w:iCs/>
+        </w:rPr>
+        <w:t>mini-project</w:t>
+      </w:r>
+      <w:proofErr w:type="gramEnd"/>
+      <w:r>
+        <w:rPr>
+          <w:b/>
+          <w:bCs/>
+          <w:i/>
+          <w:iCs/>
+        </w:rPr>
+        <w:t xml:space="preserve">: </w:t>
+      </w:r>
+      <w:hyperlink r:id="rId5" w:history="1">
+        <w:r>
+          <w:rPr>
+            <w:rStyle w:val="Hyperlink"/>
+            <w:b/>
+            <w:bCs/>
+            <w:i/>
+            <w:iCs/>
+          </w:rPr>
+          <w:t>https://github.com/it-202a-nguyenminhtrung/ss4-miniproject</w:t>
+        </w:r>
+      </w:hyperlink>
     </w:p>
     <w:p>
       <w:r>
@@ -416,15 +2860,188 @@
         </w:numPr>
       </w:pPr>
       <w:r>
-        <w:t> Trong quá trình thực hành, em gặp những khó khăn nào?</w:t>
+        <w:t xml:space="preserve"> Trong </w:t>
+      </w:r>
+      <w:proofErr w:type="spellStart"/>
+      <w:r>
+        <w:t>quá</w:t>
+      </w:r>
+      <w:proofErr w:type="spellEnd"/>
+      <w:r>
+        <w:t xml:space="preserve"> </w:t>
+      </w:r>
+      <w:proofErr w:type="spellStart"/>
+      <w:r>
+        <w:t>trình</w:t>
+      </w:r>
+      <w:proofErr w:type="spellEnd"/>
+      <w:r>
+        <w:t xml:space="preserve"> </w:t>
+      </w:r>
+      <w:proofErr w:type="spellStart"/>
+      <w:r>
+        <w:t>thực</w:t>
+      </w:r>
+      <w:proofErr w:type="spellEnd"/>
+      <w:r>
+        <w:t xml:space="preserve"> </w:t>
+      </w:r>
+      <w:proofErr w:type="spellStart"/>
+      <w:r>
+        <w:t>hành</w:t>
+      </w:r>
+      <w:proofErr w:type="spellEnd"/>
+      <w:r>
+        <w:t xml:space="preserve">, </w:t>
+      </w:r>
+      <w:proofErr w:type="spellStart"/>
+      <w:r>
+        <w:t>em</w:t>
+      </w:r>
+      <w:proofErr w:type="spellEnd"/>
+      <w:r>
+        <w:t xml:space="preserve"> </w:t>
+      </w:r>
+      <w:proofErr w:type="spellStart"/>
+      <w:r>
+        <w:t>gặp</w:t>
+      </w:r>
+      <w:proofErr w:type="spellEnd"/>
+      <w:r>
+        <w:t xml:space="preserve"> </w:t>
+      </w:r>
+      <w:proofErr w:type="spellStart"/>
+      <w:r>
+        <w:t>những</w:t>
+      </w:r>
+      <w:proofErr w:type="spellEnd"/>
+      <w:r>
+        <w:t xml:space="preserve"> </w:t>
+      </w:r>
+      <w:proofErr w:type="spellStart"/>
+      <w:r>
+        <w:t>khó</w:t>
+      </w:r>
+      <w:proofErr w:type="spellEnd"/>
+      <w:r>
+        <w:t xml:space="preserve"> </w:t>
+      </w:r>
+      <w:proofErr w:type="spellStart"/>
+      <w:r>
+        <w:t>khăn</w:t>
+      </w:r>
+      <w:proofErr w:type="spellEnd"/>
+      <w:r>
+        <w:t xml:space="preserve"> </w:t>
+      </w:r>
+      <w:proofErr w:type="spellStart"/>
+      <w:r>
+        <w:t>nào</w:t>
+      </w:r>
+      <w:proofErr w:type="spellEnd"/>
+      <w:r>
+        <w:t>?</w:t>
       </w:r>
     </w:p>
     <w:p>
       <w:r>
         <w:t xml:space="preserve">Em </w:t>
       </w:r>
-      <w:r>
-        <w:t>gặp khó khi sửa hoặc xóa dữ liệu hàng loại do chế độ safe mode</w:t>
+      <w:proofErr w:type="spellStart"/>
+      <w:r>
+        <w:t>gặp</w:t>
+      </w:r>
+      <w:proofErr w:type="spellEnd"/>
+      <w:r>
+        <w:t xml:space="preserve"> </w:t>
+      </w:r>
+      <w:proofErr w:type="spellStart"/>
+      <w:r>
+        <w:t>khó</w:t>
+      </w:r>
+      <w:proofErr w:type="spellEnd"/>
+      <w:r>
+        <w:t xml:space="preserve"> </w:t>
+      </w:r>
+      <w:proofErr w:type="spellStart"/>
+      <w:r>
+        <w:t>khi</w:t>
+      </w:r>
+      <w:proofErr w:type="spellEnd"/>
+      <w:r>
+        <w:t xml:space="preserve"> </w:t>
+      </w:r>
+      <w:proofErr w:type="spellStart"/>
+      <w:r>
+        <w:t>sửa</w:t>
+      </w:r>
+      <w:proofErr w:type="spellEnd"/>
+      <w:r>
+        <w:t xml:space="preserve"> </w:t>
+      </w:r>
+      <w:proofErr w:type="spellStart"/>
+      <w:r>
+        <w:t>hoặc</w:t>
+      </w:r>
+      <w:proofErr w:type="spellEnd"/>
+      <w:r>
+        <w:t xml:space="preserve"> </w:t>
+      </w:r>
+      <w:proofErr w:type="spellStart"/>
+      <w:r>
+        <w:t>xóa</w:t>
+      </w:r>
+      <w:proofErr w:type="spellEnd"/>
+      <w:r>
+        <w:t xml:space="preserve"> </w:t>
+      </w:r>
+      <w:proofErr w:type="spellStart"/>
+      <w:r>
+        <w:t>dữ</w:t>
+      </w:r>
+      <w:proofErr w:type="spellEnd"/>
+      <w:r>
+        <w:t xml:space="preserve"> </w:t>
+      </w:r>
+      <w:proofErr w:type="spellStart"/>
+      <w:r>
+        <w:t>liệu</w:t>
+      </w:r>
+      <w:proofErr w:type="spellEnd"/>
+      <w:r>
+        <w:t xml:space="preserve"> </w:t>
+      </w:r>
+      <w:proofErr w:type="spellStart"/>
+      <w:r>
+        <w:t>hàng</w:t>
+      </w:r>
+      <w:proofErr w:type="spellEnd"/>
+      <w:r>
+        <w:t xml:space="preserve"> </w:t>
+      </w:r>
+      <w:proofErr w:type="spellStart"/>
+      <w:r>
+        <w:t>loại</w:t>
+      </w:r>
+      <w:proofErr w:type="spellEnd"/>
+      <w:r>
+        <w:t xml:space="preserve"> do </w:t>
+      </w:r>
+      <w:proofErr w:type="spellStart"/>
+      <w:r>
+        <w:t>chế</w:t>
+      </w:r>
+      <w:proofErr w:type="spellEnd"/>
+      <w:r>
+        <w:t xml:space="preserve"> </w:t>
+      </w:r>
+      <w:proofErr w:type="spellStart"/>
+      <w:r>
+        <w:t>độ</w:t>
+      </w:r>
+      <w:proofErr w:type="spellEnd"/>
+      <w:r>
+        <w:t xml:space="preserve"> safe mode</w:t>
       </w:r>
     </w:p>
     <w:p>
@@ -435,10 +3052,71 @@
         </w:numPr>
       </w:pPr>
       <w:r>
-        <w:t xml:space="preserve"> Em gặp </w:t>
-      </w:r>
-      <w:r>
-        <w:t>lỗi chế độ safe mode khi thao tác với DML</w:t>
+        <w:t xml:space="preserve"> Em </w:t>
+      </w:r>
+      <w:proofErr w:type="spellStart"/>
+      <w:r>
+        <w:t>gặp</w:t>
+      </w:r>
+      <w:proofErr w:type="spellEnd"/>
+      <w:r>
+        <w:t xml:space="preserve"> </w:t>
+      </w:r>
+      <w:proofErr w:type="spellStart"/>
+      <w:r>
+        <w:t>lỗi</w:t>
+      </w:r>
+      <w:proofErr w:type="spellEnd"/>
+      <w:r>
+        <w:t xml:space="preserve"> </w:t>
+      </w:r>
+      <w:proofErr w:type="spellStart"/>
+      <w:r>
+        <w:t>chế</w:t>
+      </w:r>
+      <w:proofErr w:type="spellEnd"/>
+      <w:r>
+        <w:t xml:space="preserve"> </w:t>
+      </w:r>
+      <w:proofErr w:type="spellStart"/>
+      <w:r>
+        <w:t>độ</w:t>
+      </w:r>
+      <w:proofErr w:type="spellEnd"/>
+      <w:r>
+        <w:t xml:space="preserve"> safe mode </w:t>
+      </w:r>
+      <w:proofErr w:type="spellStart"/>
+      <w:r>
+        <w:t>khi</w:t>
+      </w:r>
+      <w:proofErr w:type="spellEnd"/>
+      <w:r>
+        <w:t xml:space="preserve"> </w:t>
+      </w:r>
+      <w:proofErr w:type="spellStart"/>
+      <w:r>
+        <w:t>thao</w:t>
+      </w:r>
+      <w:proofErr w:type="spellEnd"/>
+      <w:r>
+        <w:t xml:space="preserve"> </w:t>
+      </w:r>
+      <w:proofErr w:type="spellStart"/>
+      <w:r>
+        <w:t>tác</w:t>
+      </w:r>
+      <w:proofErr w:type="spellEnd"/>
+      <w:r>
+        <w:t xml:space="preserve"> </w:t>
+      </w:r>
+      <w:proofErr w:type="spellStart"/>
+      <w:r>
+        <w:t>với</w:t>
+      </w:r>
+      <w:proofErr w:type="spellEnd"/>
+      <w:r>
+        <w:t xml:space="preserve"> DML</w:t>
       </w:r>
       <w:r>
         <w:t>?</w:t>
@@ -446,8 +3124,61 @@
     </w:p>
     <w:p>
       <w:r>
-        <w:t>Khi xóa hoặc cập nhật nhiều dữ liệu</w:t>
-      </w:r>
+        <w:t xml:space="preserve">Khi </w:t>
+      </w:r>
+      <w:proofErr w:type="spellStart"/>
+      <w:r>
+        <w:t>xóa</w:t>
+      </w:r>
+      <w:proofErr w:type="spellEnd"/>
+      <w:r>
+        <w:t xml:space="preserve"> </w:t>
+      </w:r>
+      <w:proofErr w:type="spellStart"/>
+      <w:r>
+        <w:t>hoặc</w:t>
+      </w:r>
+      <w:proofErr w:type="spellEnd"/>
+      <w:r>
+        <w:t xml:space="preserve"> </w:t>
+      </w:r>
+      <w:proofErr w:type="spellStart"/>
+      <w:r>
+        <w:t>cập</w:t>
+      </w:r>
+      <w:proofErr w:type="spellEnd"/>
+      <w:r>
+        <w:t xml:space="preserve"> </w:t>
+      </w:r>
+      <w:proofErr w:type="spellStart"/>
+      <w:r>
+        <w:t>nhật</w:t>
+      </w:r>
+      <w:proofErr w:type="spellEnd"/>
+      <w:r>
+        <w:t xml:space="preserve"> </w:t>
+      </w:r>
+      <w:proofErr w:type="spellStart"/>
+      <w:r>
+        <w:t>nhiều</w:t>
+      </w:r>
+      <w:proofErr w:type="spellEnd"/>
+      <w:r>
+        <w:t xml:space="preserve"> </w:t>
+      </w:r>
+      <w:proofErr w:type="spellStart"/>
+      <w:r>
+        <w:t>dữ</w:t>
+      </w:r>
+      <w:proofErr w:type="spellEnd"/>
+      <w:r>
+        <w:t xml:space="preserve"> </w:t>
+      </w:r>
+      <w:proofErr w:type="spellStart"/>
+      <w:r>
+        <w:t>liệu</w:t>
+      </w:r>
+      <w:proofErr w:type="spellEnd"/>
     </w:p>
     <w:p>
       <w:pPr>
@@ -457,15 +3188,180 @@
         </w:numPr>
       </w:pPr>
       <w:r>
-        <w:t> Em đã khắc phục các lỗi đó như thế nào?</w:t>
+        <w:t xml:space="preserve"> Em </w:t>
+      </w:r>
+      <w:proofErr w:type="spellStart"/>
+      <w:r>
+        <w:t>đã</w:t>
+      </w:r>
+      <w:proofErr w:type="spellEnd"/>
+      <w:r>
+        <w:t xml:space="preserve"> </w:t>
+      </w:r>
+      <w:proofErr w:type="spellStart"/>
+      <w:r>
+        <w:t>khắc</w:t>
+      </w:r>
+      <w:proofErr w:type="spellEnd"/>
+      <w:r>
+        <w:t xml:space="preserve"> </w:t>
+      </w:r>
+      <w:proofErr w:type="spellStart"/>
+      <w:r>
+        <w:t>phục</w:t>
+      </w:r>
+      <w:proofErr w:type="spellEnd"/>
+      <w:r>
+        <w:t xml:space="preserve"> </w:t>
+      </w:r>
+      <w:proofErr w:type="spellStart"/>
+      <w:r>
+        <w:t>các</w:t>
+      </w:r>
+      <w:proofErr w:type="spellEnd"/>
+      <w:r>
+        <w:t xml:space="preserve"> </w:t>
+      </w:r>
+      <w:proofErr w:type="spellStart"/>
+      <w:r>
+        <w:t>lỗi</w:t>
+      </w:r>
+      <w:proofErr w:type="spellEnd"/>
+      <w:r>
+        <w:t xml:space="preserve"> </w:t>
+      </w:r>
+      <w:proofErr w:type="spellStart"/>
+      <w:r>
+        <w:t>đó</w:t>
+      </w:r>
+      <w:proofErr w:type="spellEnd"/>
+      <w:r>
+        <w:t xml:space="preserve"> </w:t>
+      </w:r>
+      <w:proofErr w:type="spellStart"/>
+      <w:r>
+        <w:t>như</w:t>
+      </w:r>
+      <w:proofErr w:type="spellEnd"/>
+      <w:r>
+        <w:t xml:space="preserve"> </w:t>
+      </w:r>
+      <w:proofErr w:type="spellStart"/>
+      <w:r>
+        <w:t>thế</w:t>
+      </w:r>
+      <w:proofErr w:type="spellEnd"/>
+      <w:r>
+        <w:t xml:space="preserve"> </w:t>
+      </w:r>
+      <w:proofErr w:type="spellStart"/>
+      <w:r>
+        <w:t>nào</w:t>
+      </w:r>
+      <w:proofErr w:type="spellEnd"/>
+      <w:r>
+        <w:t>?</w:t>
       </w:r>
     </w:p>
     <w:p>
       <w:r>
-        <w:t xml:space="preserve">Em đã </w:t>
-      </w:r>
-      <w:r>
-        <w:t>tham khảo và tìm ra câu lệnh set SQL_SAFE_UPDATES = 0 để tắt chế độ safe mode.</w:t>
+        <w:t xml:space="preserve">Em </w:t>
+      </w:r>
+      <w:proofErr w:type="spellStart"/>
+      <w:r>
+        <w:t>đã</w:t>
+      </w:r>
+      <w:proofErr w:type="spellEnd"/>
+      <w:r>
+        <w:t xml:space="preserve"> </w:t>
+      </w:r>
+      <w:proofErr w:type="spellStart"/>
+      <w:r>
+        <w:t>tham</w:t>
+      </w:r>
+      <w:proofErr w:type="spellEnd"/>
+      <w:r>
+        <w:t xml:space="preserve"> </w:t>
+      </w:r>
+      <w:proofErr w:type="spellStart"/>
+      <w:r>
+        <w:t>khảo</w:t>
+      </w:r>
+      <w:proofErr w:type="spellEnd"/>
+      <w:r>
+        <w:t xml:space="preserve"> </w:t>
+      </w:r>
+      <w:proofErr w:type="spellStart"/>
+      <w:r>
+        <w:t>và</w:t>
+      </w:r>
+      <w:proofErr w:type="spellEnd"/>
+      <w:r>
+        <w:t xml:space="preserve"> </w:t>
+      </w:r>
+      <w:proofErr w:type="spellStart"/>
+      <w:r>
+        <w:t>tìm</w:t>
+      </w:r>
+      <w:proofErr w:type="spellEnd"/>
+      <w:r>
+        <w:t xml:space="preserve"> </w:t>
+      </w:r>
+      <w:proofErr w:type="spellStart"/>
+      <w:r>
+        <w:t>ra</w:t>
+      </w:r>
+      <w:proofErr w:type="spellEnd"/>
+      <w:r>
+        <w:t xml:space="preserve"> </w:t>
+      </w:r>
+      <w:proofErr w:type="spellStart"/>
+      <w:r>
+        <w:t>câu</w:t>
+      </w:r>
+      <w:proofErr w:type="spellEnd"/>
+      <w:r>
+        <w:t xml:space="preserve"> </w:t>
+      </w:r>
+      <w:proofErr w:type="spellStart"/>
+      <w:r>
+        <w:t>lệnh</w:t>
+      </w:r>
+      <w:proofErr w:type="spellEnd"/>
+      <w:r>
+        <w:t xml:space="preserve"> set SQL_SAFE_UPDATES = 0 </w:t>
+      </w:r>
+      <w:proofErr w:type="spellStart"/>
+      <w:r>
+        <w:t>để</w:t>
+      </w:r>
+      <w:proofErr w:type="spellEnd"/>
+      <w:r>
+        <w:t xml:space="preserve"> </w:t>
+      </w:r>
+      <w:proofErr w:type="spellStart"/>
+      <w:r>
+        <w:t>tắt</w:t>
+      </w:r>
+      <w:proofErr w:type="spellEnd"/>
+      <w:r>
+        <w:t xml:space="preserve"> </w:t>
+      </w:r>
+      <w:proofErr w:type="spellStart"/>
+      <w:r>
+        <w:t>chế</w:t>
+      </w:r>
+      <w:proofErr w:type="spellEnd"/>
+      <w:r>
+        <w:t xml:space="preserve"> </w:t>
+      </w:r>
+      <w:proofErr w:type="spellStart"/>
+      <w:r>
+        <w:t>độ</w:t>
+      </w:r>
+      <w:proofErr w:type="spellEnd"/>
+      <w:r>
+        <w:t xml:space="preserve"> safe mode.</w:t>
       </w:r>
     </w:p>
     <w:p>
@@ -485,16 +3381,135 @@
         </w:numPr>
       </w:pPr>
       <w:r>
-        <w:t>Kinh nghiệm rút ra từ bài thực hành:</w:t>
+        <w:t xml:space="preserve">Kinh </w:t>
+      </w:r>
+      <w:proofErr w:type="spellStart"/>
+      <w:r>
+        <w:t>nghiệm</w:t>
+      </w:r>
+      <w:proofErr w:type="spellEnd"/>
+      <w:r>
+        <w:t xml:space="preserve"> </w:t>
+      </w:r>
+      <w:proofErr w:type="spellStart"/>
+      <w:r>
+        <w:t>rút</w:t>
+      </w:r>
+      <w:proofErr w:type="spellEnd"/>
+      <w:r>
+        <w:t xml:space="preserve"> </w:t>
+      </w:r>
+      <w:proofErr w:type="spellStart"/>
+      <w:r>
+        <w:t>ra</w:t>
+      </w:r>
+      <w:proofErr w:type="spellEnd"/>
+      <w:r>
+        <w:t xml:space="preserve"> </w:t>
+      </w:r>
+      <w:proofErr w:type="spellStart"/>
+      <w:r>
+        <w:t>từ</w:t>
+      </w:r>
+      <w:proofErr w:type="spellEnd"/>
+      <w:r>
+        <w:t xml:space="preserve"> </w:t>
+      </w:r>
+      <w:proofErr w:type="spellStart"/>
+      <w:r>
+        <w:t>bài</w:t>
+      </w:r>
+      <w:proofErr w:type="spellEnd"/>
+      <w:r>
+        <w:t xml:space="preserve"> </w:t>
+      </w:r>
+      <w:proofErr w:type="spellStart"/>
+      <w:r>
+        <w:t>thực</w:t>
+      </w:r>
+      <w:proofErr w:type="spellEnd"/>
+      <w:r>
+        <w:t xml:space="preserve"> </w:t>
+      </w:r>
+      <w:proofErr w:type="spellStart"/>
+      <w:r>
+        <w:t>hành</w:t>
+      </w:r>
+      <w:proofErr w:type="spellEnd"/>
+      <w:r>
+        <w:t>:</w:t>
       </w:r>
     </w:p>
     <w:p>
-      <w:r>
-        <w:t xml:space="preserve">Nên sử dụng </w:t>
-      </w:r>
-      <w:r>
-        <w:t>kiểu dữ liệu chính xác hợn</w:t>
-      </w:r>
+      <w:proofErr w:type="spellStart"/>
+      <w:r>
+        <w:t>Nên</w:t>
+      </w:r>
+      <w:proofErr w:type="spellEnd"/>
+      <w:r>
+        <w:t xml:space="preserve"> </w:t>
+      </w:r>
+      <w:proofErr w:type="spellStart"/>
+      <w:r>
+        <w:t>sử</w:t>
+      </w:r>
+      <w:proofErr w:type="spellEnd"/>
+      <w:r>
+        <w:t xml:space="preserve"> </w:t>
+      </w:r>
+      <w:proofErr w:type="spellStart"/>
+      <w:r>
+        <w:t>dụng</w:t>
+      </w:r>
+      <w:proofErr w:type="spellEnd"/>
+      <w:r>
+        <w:t xml:space="preserve"> </w:t>
+      </w:r>
+      <w:proofErr w:type="spellStart"/>
+      <w:r>
+        <w:t>kiểu</w:t>
+      </w:r>
+      <w:proofErr w:type="spellEnd"/>
+      <w:r>
+        <w:t xml:space="preserve"> </w:t>
+      </w:r>
+      <w:proofErr w:type="spellStart"/>
+      <w:r>
+        <w:t>dữ</w:t>
+      </w:r>
+      <w:proofErr w:type="spellEnd"/>
+      <w:r>
+        <w:t xml:space="preserve"> </w:t>
+      </w:r>
+      <w:proofErr w:type="spellStart"/>
+      <w:r>
+        <w:t>liệu</w:t>
+      </w:r>
+      <w:proofErr w:type="spellEnd"/>
+      <w:r>
+        <w:t xml:space="preserve"> </w:t>
+      </w:r>
+      <w:proofErr w:type="spellStart"/>
+      <w:r>
+        <w:t>chính</w:t>
+      </w:r>
+      <w:proofErr w:type="spellEnd"/>
+      <w:r>
+        <w:t xml:space="preserve"> </w:t>
+      </w:r>
+      <w:proofErr w:type="spellStart"/>
+      <w:r>
+        <w:t>xác</w:t>
+      </w:r>
+      <w:proofErr w:type="spellEnd"/>
+      <w:r>
+        <w:t xml:space="preserve"> </w:t>
+      </w:r>
+      <w:proofErr w:type="spellStart"/>
+      <w:r>
+        <w:t>hợn</w:t>
+      </w:r>
+      <w:proofErr w:type="spellEnd"/>
     </w:p>
     <w:p>
       <w:pPr>
@@ -504,17 +3519,139 @@
         </w:numPr>
       </w:pPr>
       <w:r>
-        <w:t>Lưu ý các em cần note lại cho những buổi thực hành sau:</w:t>
+        <w:t xml:space="preserve">Lưu ý </w:t>
+      </w:r>
+      <w:proofErr w:type="spellStart"/>
+      <w:r>
+        <w:t>các</w:t>
+      </w:r>
+      <w:proofErr w:type="spellEnd"/>
+      <w:r>
+        <w:t xml:space="preserve"> </w:t>
+      </w:r>
+      <w:proofErr w:type="spellStart"/>
+      <w:r>
+        <w:t>em</w:t>
+      </w:r>
+      <w:proofErr w:type="spellEnd"/>
+      <w:r>
+        <w:t xml:space="preserve"> </w:t>
+      </w:r>
+      <w:proofErr w:type="spellStart"/>
+      <w:r>
+        <w:t>cần</w:t>
+      </w:r>
+      <w:proofErr w:type="spellEnd"/>
+      <w:r>
+        <w:t xml:space="preserve"> note </w:t>
+      </w:r>
+      <w:proofErr w:type="spellStart"/>
+      <w:r>
+        <w:t>lại</w:t>
+      </w:r>
+      <w:proofErr w:type="spellEnd"/>
+      <w:r>
+        <w:t xml:space="preserve"> </w:t>
+      </w:r>
+      <w:proofErr w:type="spellStart"/>
+      <w:r>
+        <w:t>cho</w:t>
+      </w:r>
+      <w:proofErr w:type="spellEnd"/>
+      <w:r>
+        <w:t xml:space="preserve"> </w:t>
+      </w:r>
+      <w:proofErr w:type="spellStart"/>
+      <w:r>
+        <w:t>những</w:t>
+      </w:r>
+      <w:proofErr w:type="spellEnd"/>
+      <w:r>
+        <w:t xml:space="preserve"> </w:t>
+      </w:r>
+      <w:proofErr w:type="spellStart"/>
+      <w:r>
+        <w:t>buổi</w:t>
+      </w:r>
+      <w:proofErr w:type="spellEnd"/>
+      <w:r>
+        <w:t xml:space="preserve"> </w:t>
+      </w:r>
+      <w:proofErr w:type="spellStart"/>
+      <w:r>
+        <w:t>thực</w:t>
+      </w:r>
+      <w:proofErr w:type="spellEnd"/>
+      <w:r>
+        <w:t xml:space="preserve"> </w:t>
+      </w:r>
+      <w:proofErr w:type="spellStart"/>
+      <w:r>
+        <w:t>hành</w:t>
+      </w:r>
+      <w:proofErr w:type="spellEnd"/>
+      <w:r>
+        <w:t xml:space="preserve"> </w:t>
+      </w:r>
+      <w:proofErr w:type="spellStart"/>
+      <w:r>
+        <w:t>sau</w:t>
+      </w:r>
+      <w:proofErr w:type="spellEnd"/>
+      <w:r>
+        <w:t>:</w:t>
       </w:r>
     </w:p>
     <w:p>
       <w:r>
         <w:lastRenderedPageBreak/>
-        <w:t xml:space="preserve">Lưu ý khi sử dụng </w:t>
-      </w:r>
-      <w:r>
-        <w:t>kiểu dữ liệu</w:t>
-      </w:r>
+        <w:t xml:space="preserve">Lưu ý </w:t>
+      </w:r>
+      <w:proofErr w:type="spellStart"/>
+      <w:r>
+        <w:t>khi</w:t>
+      </w:r>
+      <w:proofErr w:type="spellEnd"/>
+      <w:r>
+        <w:t xml:space="preserve"> </w:t>
+      </w:r>
+      <w:proofErr w:type="spellStart"/>
+      <w:r>
+        <w:t>sử</w:t>
+      </w:r>
+      <w:proofErr w:type="spellEnd"/>
+      <w:r>
+        <w:t xml:space="preserve"> </w:t>
+      </w:r>
+      <w:proofErr w:type="spellStart"/>
+      <w:r>
+        <w:t>dụng</w:t>
+      </w:r>
+      <w:proofErr w:type="spellEnd"/>
+      <w:r>
+        <w:t xml:space="preserve"> </w:t>
+      </w:r>
+      <w:proofErr w:type="spellStart"/>
+      <w:r>
+        <w:t>kiểu</w:t>
+      </w:r>
+      <w:proofErr w:type="spellEnd"/>
+      <w:r>
+        <w:t xml:space="preserve"> </w:t>
+      </w:r>
+      <w:proofErr w:type="spellStart"/>
+      <w:r>
+        <w:t>dữ</w:t>
+      </w:r>
+      <w:proofErr w:type="spellEnd"/>
+      <w:r>
+        <w:t xml:space="preserve"> </w:t>
+      </w:r>
+      <w:proofErr w:type="spellStart"/>
+      <w:r>
+        <w:t>liệu</w:t>
+      </w:r>
+      <w:proofErr w:type="spellEnd"/>
     </w:p>
     <w:p>
       <w:r>
@@ -527,12 +3664,137 @@
     </w:p>
     <w:p>
       <w:r>
-        <w:t>Em có đề xuất hoặc kiến nghị gì để buổi thực hành hiệu quả hơn?</w:t>
+        <w:t xml:space="preserve">Em </w:t>
+      </w:r>
+      <w:proofErr w:type="spellStart"/>
+      <w:r>
+        <w:t>có</w:t>
+      </w:r>
+      <w:proofErr w:type="spellEnd"/>
+      <w:r>
+        <w:t xml:space="preserve"> </w:t>
+      </w:r>
+      <w:proofErr w:type="spellStart"/>
+      <w:r>
+        <w:t>đề</w:t>
+      </w:r>
+      <w:proofErr w:type="spellEnd"/>
+      <w:r>
+        <w:t xml:space="preserve"> </w:t>
+      </w:r>
+      <w:proofErr w:type="spellStart"/>
+      <w:r>
+        <w:t>xuất</w:t>
+      </w:r>
+      <w:proofErr w:type="spellEnd"/>
+      <w:r>
+        <w:t xml:space="preserve"> </w:t>
+      </w:r>
+      <w:proofErr w:type="spellStart"/>
+      <w:r>
+        <w:t>hoặc</w:t>
+      </w:r>
+      <w:proofErr w:type="spellEnd"/>
+      <w:r>
+        <w:t xml:space="preserve"> </w:t>
+      </w:r>
+      <w:proofErr w:type="spellStart"/>
+      <w:r>
+        <w:t>kiến</w:t>
+      </w:r>
+      <w:proofErr w:type="spellEnd"/>
+      <w:r>
+        <w:t xml:space="preserve"> </w:t>
+      </w:r>
+      <w:proofErr w:type="spellStart"/>
+      <w:r>
+        <w:t>nghị</w:t>
+      </w:r>
+      <w:proofErr w:type="spellEnd"/>
+      <w:r>
+        <w:t xml:space="preserve"> </w:t>
+      </w:r>
+      <w:proofErr w:type="spellStart"/>
+      <w:r>
+        <w:t>gì</w:t>
+      </w:r>
+      <w:proofErr w:type="spellEnd"/>
+      <w:r>
+        <w:t xml:space="preserve"> </w:t>
+      </w:r>
+      <w:proofErr w:type="spellStart"/>
+      <w:r>
+        <w:t>để</w:t>
+      </w:r>
+      <w:proofErr w:type="spellEnd"/>
+      <w:r>
+        <w:t xml:space="preserve"> </w:t>
+      </w:r>
+      <w:proofErr w:type="spellStart"/>
+      <w:r>
+        <w:t>buổi</w:t>
+      </w:r>
+      <w:proofErr w:type="spellEnd"/>
+      <w:r>
+        <w:t xml:space="preserve"> </w:t>
+      </w:r>
+      <w:proofErr w:type="spellStart"/>
+      <w:r>
+        <w:t>thực</w:t>
+      </w:r>
+      <w:proofErr w:type="spellEnd"/>
+      <w:r>
+        <w:t xml:space="preserve"> </w:t>
+      </w:r>
+      <w:proofErr w:type="spellStart"/>
+      <w:r>
+        <w:t>hành</w:t>
+      </w:r>
+      <w:proofErr w:type="spellEnd"/>
+      <w:r>
+        <w:t xml:space="preserve"> </w:t>
+      </w:r>
+      <w:proofErr w:type="spellStart"/>
+      <w:r>
+        <w:t>hiệu</w:t>
+      </w:r>
+      <w:proofErr w:type="spellEnd"/>
+      <w:r>
+        <w:t xml:space="preserve"> </w:t>
+      </w:r>
+      <w:proofErr w:type="spellStart"/>
+      <w:r>
+        <w:t>quả</w:t>
+      </w:r>
+      <w:proofErr w:type="spellEnd"/>
+      <w:r>
+        <w:t xml:space="preserve"> </w:t>
+      </w:r>
+      <w:proofErr w:type="spellStart"/>
+      <w:r>
+        <w:t>hơn</w:t>
+      </w:r>
+      <w:proofErr w:type="spellEnd"/>
+      <w:r>
+        <w:t>?</w:t>
       </w:r>
     </w:p>
     <w:p>
-      <w:r>
-        <w:t>Không có.</w:t>
+      <w:proofErr w:type="spellStart"/>
+      <w:r>
+        <w:t>Không</w:t>
+      </w:r>
+      <w:proofErr w:type="spellEnd"/>
+      <w:r>
+        <w:t xml:space="preserve"> </w:t>
+      </w:r>
+      <w:proofErr w:type="spellStart"/>
+      <w:r>
+        <w:t>có</w:t>
+      </w:r>
+      <w:proofErr w:type="spellEnd"/>
+      <w:r>
+        <w:t>.</w:t>
       </w:r>
     </w:p>
     <w:p>
@@ -551,14 +3813,101 @@
           <w:numId w:val="9"/>
         </w:numPr>
       </w:pPr>
-      <w:r>
-        <w:t>Tự đánh giá khả năng hiểu bài.</w:t>
+      <w:proofErr w:type="spellStart"/>
+      <w:r>
+        <w:t>Tự</w:t>
+      </w:r>
+      <w:proofErr w:type="spellEnd"/>
+      <w:r>
+        <w:t xml:space="preserve"> </w:t>
+      </w:r>
+      <w:proofErr w:type="spellStart"/>
+      <w:r>
+        <w:t>đánh</w:t>
+      </w:r>
+      <w:proofErr w:type="spellEnd"/>
+      <w:r>
+        <w:t xml:space="preserve"> </w:t>
+      </w:r>
+      <w:proofErr w:type="spellStart"/>
+      <w:r>
+        <w:t>giá</w:t>
+      </w:r>
+      <w:proofErr w:type="spellEnd"/>
+      <w:r>
+        <w:t xml:space="preserve"> </w:t>
+      </w:r>
+      <w:proofErr w:type="spellStart"/>
+      <w:r>
+        <w:t>khả</w:t>
+      </w:r>
+      <w:proofErr w:type="spellEnd"/>
+      <w:r>
+        <w:t xml:space="preserve"> </w:t>
+      </w:r>
+      <w:proofErr w:type="spellStart"/>
+      <w:r>
+        <w:t>năng</w:t>
+      </w:r>
+      <w:proofErr w:type="spellEnd"/>
+      <w:r>
+        <w:t xml:space="preserve"> </w:t>
+      </w:r>
+      <w:proofErr w:type="spellStart"/>
+      <w:r>
+        <w:t>hiểu</w:t>
+      </w:r>
+      <w:proofErr w:type="spellEnd"/>
+      <w:r>
+        <w:t xml:space="preserve"> </w:t>
+      </w:r>
+      <w:proofErr w:type="spellStart"/>
+      <w:r>
+        <w:t>bài</w:t>
+      </w:r>
+      <w:proofErr w:type="spellEnd"/>
+      <w:r>
+        <w:t>.</w:t>
       </w:r>
     </w:p>
     <w:p>
-      <w:r>
-        <w:t>Khả năng hiểu bài khá</w:t>
-      </w:r>
+      <w:proofErr w:type="spellStart"/>
+      <w:r>
+        <w:t>Khả</w:t>
+      </w:r>
+      <w:proofErr w:type="spellEnd"/>
+      <w:r>
+        <w:t xml:space="preserve"> </w:t>
+      </w:r>
+      <w:proofErr w:type="spellStart"/>
+      <w:r>
+        <w:t>năng</w:t>
+      </w:r>
+      <w:proofErr w:type="spellEnd"/>
+      <w:r>
+        <w:t xml:space="preserve"> </w:t>
+      </w:r>
+      <w:proofErr w:type="spellStart"/>
+      <w:r>
+        <w:t>hiểu</w:t>
+      </w:r>
+      <w:proofErr w:type="spellEnd"/>
+      <w:r>
+        <w:t xml:space="preserve"> </w:t>
+      </w:r>
+      <w:proofErr w:type="spellStart"/>
+      <w:r>
+        <w:t>bài</w:t>
+      </w:r>
+      <w:proofErr w:type="spellEnd"/>
+      <w:r>
+        <w:t xml:space="preserve"> </w:t>
+      </w:r>
+      <w:proofErr w:type="spellStart"/>
+      <w:r>
+        <w:t>khá</w:t>
+      </w:r>
+      <w:proofErr w:type="spellEnd"/>
     </w:p>
     <w:p>
       <w:pPr>
@@ -567,16 +3916,143 @@
           <w:numId w:val="9"/>
         </w:numPr>
       </w:pPr>
-      <w:r>
-        <w:t>Giúp ích gì cho việc học lập trình. </w:t>
+      <w:proofErr w:type="spellStart"/>
+      <w:r>
+        <w:t>Giúp</w:t>
+      </w:r>
+      <w:proofErr w:type="spellEnd"/>
+      <w:r>
+        <w:t xml:space="preserve"> </w:t>
+      </w:r>
+      <w:proofErr w:type="spellStart"/>
+      <w:r>
+        <w:t>ích</w:t>
+      </w:r>
+      <w:proofErr w:type="spellEnd"/>
+      <w:r>
+        <w:t xml:space="preserve"> </w:t>
+      </w:r>
+      <w:proofErr w:type="spellStart"/>
+      <w:r>
+        <w:t>gì</w:t>
+      </w:r>
+      <w:proofErr w:type="spellEnd"/>
+      <w:r>
+        <w:t xml:space="preserve"> </w:t>
+      </w:r>
+      <w:proofErr w:type="spellStart"/>
+      <w:r>
+        <w:t>cho</w:t>
+      </w:r>
+      <w:proofErr w:type="spellEnd"/>
+      <w:r>
+        <w:t xml:space="preserve"> </w:t>
+      </w:r>
+      <w:proofErr w:type="spellStart"/>
+      <w:r>
+        <w:t>việc</w:t>
+      </w:r>
+      <w:proofErr w:type="spellEnd"/>
+      <w:r>
+        <w:t xml:space="preserve"> </w:t>
+      </w:r>
+      <w:proofErr w:type="spellStart"/>
+      <w:r>
+        <w:t>học</w:t>
+      </w:r>
+      <w:proofErr w:type="spellEnd"/>
+      <w:r>
+        <w:t xml:space="preserve"> </w:t>
+      </w:r>
+      <w:proofErr w:type="spellStart"/>
+      <w:r>
+        <w:t>lập</w:t>
+      </w:r>
+      <w:proofErr w:type="spellEnd"/>
+      <w:r>
+        <w:t xml:space="preserve"> </w:t>
+      </w:r>
+      <w:proofErr w:type="spellStart"/>
+      <w:r>
+        <w:t>trình</w:t>
+      </w:r>
+      <w:proofErr w:type="spellEnd"/>
+      <w:r>
+        <w:t>. </w:t>
       </w:r>
     </w:p>
     <w:p>
-      <w:r>
-        <w:t xml:space="preserve">Giúp cho em hiểu hơn về </w:t>
-      </w:r>
-      <w:r>
-        <w:t>mySQL cơ bản.</w:t>
+      <w:proofErr w:type="spellStart"/>
+      <w:r>
+        <w:t>Giúp</w:t>
+      </w:r>
+      <w:proofErr w:type="spellEnd"/>
+      <w:r>
+        <w:t xml:space="preserve"> </w:t>
+      </w:r>
+      <w:proofErr w:type="spellStart"/>
+      <w:r>
+        <w:t>cho</w:t>
+      </w:r>
+      <w:proofErr w:type="spellEnd"/>
+      <w:r>
+        <w:t xml:space="preserve"> </w:t>
+      </w:r>
+      <w:proofErr w:type="spellStart"/>
+      <w:r>
+        <w:t>em</w:t>
+      </w:r>
+      <w:proofErr w:type="spellEnd"/>
+      <w:r>
+        <w:t xml:space="preserve"> </w:t>
+      </w:r>
+      <w:proofErr w:type="spellStart"/>
+      <w:r>
+        <w:t>hiểu</w:t>
+      </w:r>
+      <w:proofErr w:type="spellEnd"/>
+      <w:r>
+        <w:t xml:space="preserve"> </w:t>
+      </w:r>
+      <w:proofErr w:type="spellStart"/>
+      <w:r>
+        <w:t>hơn</w:t>
+      </w:r>
+      <w:proofErr w:type="spellEnd"/>
+      <w:r>
+        <w:t xml:space="preserve"> </w:t>
+      </w:r>
+      <w:proofErr w:type="spellStart"/>
+      <w:r>
+        <w:t>về</w:t>
+      </w:r>
+      <w:proofErr w:type="spellEnd"/>
+      <w:r>
+        <w:t xml:space="preserve"> </w:t>
+      </w:r>
+      <w:proofErr w:type="spellStart"/>
+      <w:r>
+        <w:t>mySQL</w:t>
+      </w:r>
+      <w:proofErr w:type="spellEnd"/>
+      <w:r>
+        <w:t xml:space="preserve"> </w:t>
+      </w:r>
+      <w:proofErr w:type="spellStart"/>
+      <w:r>
+        <w:t>cơ</w:t>
+      </w:r>
+      <w:proofErr w:type="spellEnd"/>
+      <w:r>
+        <w:t xml:space="preserve"> </w:t>
+      </w:r>
+      <w:proofErr w:type="spellStart"/>
+      <w:r>
+        <w:t>bản</w:t>
+      </w:r>
+      <w:proofErr w:type="spellEnd"/>
+      <w:r>
+        <w:t>.</w:t>
       </w:r>
     </w:p>
     <w:p/>
@@ -2632,6 +6108,29 @@
       <w:spacing w:val="5"/>
     </w:rPr>
   </w:style>
+  <w:style w:type="character" w:styleId="Hyperlink">
+    <w:name w:val="Hyperlink"/>
+    <w:basedOn w:val="DefaultParagraphFont"/>
+    <w:uiPriority w:val="99"/>
+    <w:unhideWhenUsed/>
+    <w:rsid w:val="005B2B05"/>
+    <w:rPr>
+      <w:color w:val="467886" w:themeColor="hyperlink"/>
+      <w:u w:val="single"/>
+    </w:rPr>
+  </w:style>
+  <w:style w:type="character" w:styleId="UnresolvedMention">
+    <w:name w:val="Unresolved Mention"/>
+    <w:basedOn w:val="DefaultParagraphFont"/>
+    <w:uiPriority w:val="99"/>
+    <w:semiHidden/>
+    <w:unhideWhenUsed/>
+    <w:rsid w:val="005B2B05"/>
+    <w:rPr>
+      <w:color w:val="605E5C"/>
+      <w:shd w:val="clear" w:color="auto" w:fill="E1DFDD"/>
+    </w:rPr>
+  </w:style>
 </w:styles>
 </file>
 

</xml_diff>